<commit_message>
Add high-resolution charts, increase table and body font sizes, and include prominent GitHub links in report
</commit_message>
<xml_diff>
--- a/INT315_Bank_Transaction_Fraud_Detection_Project_Report_12317465.docx
+++ b/INT315_Bank_Transaction_Fraud_Detection_Project_Report_12317465.docx
@@ -4,14 +4,14 @@
   <w:body>
     <w:p>
       <w:pPr>
-        <w:spacing w:before="400" w:after="160"/>
+        <w:spacing w:before="400" w:after="240"/>
         <w:jc w:val="center"/>
       </w:pPr>
       <w:r>
         <w:rPr>
           <w:rFonts w:ascii="Times New Roman" w:hAnsi="Times New Roman"/>
           <w:b/>
-          <w:sz w:val="28"/>
+          <w:sz w:val="30"/>
         </w:rPr>
         <w:t>CLUSTER COMPUTING PROJECT REPORT</w:t>
         <w:br/>
@@ -27,7 +27,7 @@
         <w:rPr>
           <w:rFonts w:ascii="Times New Roman" w:hAnsi="Times New Roman"/>
           <w:b/>
-          <w:sz w:val="36"/>
+          <w:sz w:val="40"/>
         </w:rPr>
         <w:t>Bank Transaction Fraud Detection and Analytics</w:t>
         <w:br/>
@@ -42,7 +42,7 @@
       <w:r>
         <w:rPr>
           <w:rFonts w:ascii="Times New Roman" w:hAnsi="Times New Roman"/>
-          <w:sz w:val="24"/>
+          <w:sz w:val="26"/>
         </w:rPr>
         <w:t>Submitted by</w:t>
         <w:br/>
@@ -52,7 +52,7 @@
         <w:rPr>
           <w:rFonts w:ascii="Times New Roman" w:hAnsi="Times New Roman"/>
           <w:b/>
-          <w:sz w:val="28"/>
+          <w:sz w:val="30"/>
         </w:rPr>
         <w:t>Shayan Akhtar</w:t>
         <w:br/>
@@ -60,7 +60,7 @@
       <w:r>
         <w:rPr>
           <w:rFonts w:ascii="Times New Roman" w:hAnsi="Times New Roman"/>
-          <w:sz w:val="24"/>
+          <w:sz w:val="26"/>
         </w:rPr>
         <w:t>Registration No: 12317465</w:t>
         <w:br/>
@@ -111,14 +111,22 @@
         <w:spacing w:line="312" w:lineRule="auto" w:after="720"/>
       </w:pPr>
       <w:r>
+        <w:rPr>
+          <w:rFonts w:ascii="Times New Roman" w:hAnsi="Times New Roman"/>
+          <w:sz w:val="24"/>
+        </w:rPr>
         <w:t>This is to certify that Shayan Akhtar bearing Registration no. 12317465, Roll no. 24, Section K23WS has successfully completed the INT 315 Cluster Computing project titled, "Bank Transaction Fraud Detection and Analytics Using Apache Spark and PySpark" under my guidance and supervision. To the best of my knowledge, the present work is the result of his original development, analytical study, and practical implementation.</w:t>
       </w:r>
     </w:p>
     <w:p>
       <w:pPr>
-        <w:spacing w:line="288" w:lineRule="auto" w:before="800"/>
+        <w:spacing w:line="300" w:lineRule="auto" w:before="800"/>
       </w:pPr>
       <w:r>
+        <w:rPr>
+          <w:rFonts w:ascii="Times New Roman" w:hAnsi="Times New Roman"/>
+          <w:sz w:val="24"/>
+        </w:rPr>
         <w:t>Signature: _______________________</w:t>
         <w:br/>
         <w:t>Name of the Supervisor: Course Faculty</w:t>
@@ -159,14 +167,22 @@
         <w:spacing w:line="312" w:lineRule="auto" w:after="720"/>
       </w:pPr>
       <w:r>
+        <w:rPr>
+          <w:rFonts w:ascii="Times New Roman" w:hAnsi="Times New Roman"/>
+          <w:sz w:val="24"/>
+        </w:rPr>
         <w:t>I, Shayan Akhtar, student of Bachelor of Technology in Computer Science and Engineering (Section K23WS) under CSE/IT Discipline at Lovely Professional University, Punjab, hereby declare that all the information furnished in this project report is based on my own intensive work and is genuine. The project work titled, "Bank Transaction Fraud Detection and Analytics Using Apache Spark and PySpark" has been executed and documented independently under academic supervision, and has not been submitted elsewhere for the award of any other degree or diploma.</w:t>
       </w:r>
     </w:p>
     <w:p>
       <w:pPr>
-        <w:spacing w:line="288" w:lineRule="auto" w:before="800"/>
+        <w:spacing w:line="300" w:lineRule="auto" w:before="800"/>
       </w:pPr>
       <w:r>
+        <w:rPr>
+          <w:rFonts w:ascii="Times New Roman" w:hAnsi="Times New Roman"/>
+          <w:sz w:val="24"/>
+        </w:rPr>
         <w:t>Date: 24/10/2026                                    Signature: _______________________</w:t>
         <w:br/>
         <w:br/>
@@ -203,6 +219,10 @@
         <w:spacing w:line="300" w:lineRule="auto" w:after="240"/>
       </w:pPr>
       <w:r>
+        <w:rPr>
+          <w:rFonts w:ascii="Times New Roman" w:hAnsi="Times New Roman"/>
+          <w:sz w:val="24"/>
+        </w:rPr>
         <w:t>I would like to express my sincere gratitude to my course instructor and mentor for their valuable guidance, continuous support, and encouragement throughout the completion of this cluster computing project. Their technical insights and constructive feedback greatly enhanced my understanding of distributed data architectures, Apache Spark execution paradigms, and Spark MLlib pipelines.</w:t>
       </w:r>
     </w:p>
@@ -211,6 +231,10 @@
         <w:spacing w:line="300" w:lineRule="auto" w:after="240"/>
       </w:pPr>
       <w:r>
+        <w:rPr>
+          <w:rFonts w:ascii="Times New Roman" w:hAnsi="Times New Roman"/>
+          <w:sz w:val="24"/>
+        </w:rPr>
         <w:t>I also thank the School of Computer Science and Engineering, Lovely Professional University, for providing the academic environment, computational infrastructure, and resources required to carry out this project successfully. The structured curriculum and practical laboratory exposure offered by the university played a vital role in strengthening my distributed machine learning and analytical skills.</w:t>
       </w:r>
     </w:p>
@@ -219,6 +243,10 @@
         <w:spacing w:line="300" w:lineRule="auto" w:after="240"/>
       </w:pPr>
       <w:r>
+        <w:rPr>
+          <w:rFonts w:ascii="Times New Roman" w:hAnsi="Times New Roman"/>
+          <w:sz w:val="24"/>
+        </w:rPr>
         <w:t>I am grateful to my peers and classmates for their cooperation, constructive discussions, and assistance during various stages of the project, especially during data quality auditing, feature engineering, and model evaluation on large-scale datasets.</w:t>
       </w:r>
     </w:p>
@@ -227,6 +255,10 @@
         <w:spacing w:line="300" w:lineRule="auto" w:after="240"/>
       </w:pPr>
       <w:r>
+        <w:rPr>
+          <w:rFonts w:ascii="Times New Roman" w:hAnsi="Times New Roman"/>
+          <w:sz w:val="24"/>
+        </w:rPr>
         <w:t>Finally, I extend my heartfelt thanks to my family for their constant encouragement, patience, and moral support, which motivated me to complete this project with dedication and confidence.</w:t>
       </w:r>
     </w:p>
@@ -273,8 +305,79 @@
           <w:tcPr>
             <w:tcW w:type="dxa" w:w="3120"/>
             <w:tcMar>
-              <w:top w:w="80" w:type="dxa"/>
-              <w:bottom w:w="80" w:type="dxa"/>
+              <w:top w:w="90" w:type="dxa"/>
+              <w:bottom w:w="90" w:type="dxa"/>
+              <w:left w:w="120" w:type="dxa"/>
+              <w:right w:w="120" w:type="dxa"/>
+            </w:tcMar>
+          </w:tcPr>
+          <w:p>
+            <w:pPr>
+              <w:jc w:val="center"/>
+            </w:pPr>
+            <w:r>
+              <w:rPr>
+                <w:rFonts w:ascii="Times New Roman" w:hAnsi="Times New Roman"/>
+                <w:b/>
+                <w:sz w:val="25"/>
+              </w:rPr>
+              <w:t>S.No.</w:t>
+            </w:r>
+          </w:p>
+        </w:tc>
+        <w:tc>
+          <w:tcPr>
+            <w:tcW w:type="dxa" w:w="3120"/>
+            <w:tcMar>
+              <w:top w:w="90" w:type="dxa"/>
+              <w:bottom w:w="90" w:type="dxa"/>
+              <w:left w:w="120" w:type="dxa"/>
+              <w:right w:w="120" w:type="dxa"/>
+            </w:tcMar>
+          </w:tcPr>
+          <w:p>
+            <w:r>
+              <w:rPr>
+                <w:rFonts w:ascii="Times New Roman" w:hAnsi="Times New Roman"/>
+                <w:b/>
+                <w:sz w:val="25"/>
+              </w:rPr>
+              <w:t>Table of Contents</w:t>
+            </w:r>
+          </w:p>
+        </w:tc>
+        <w:tc>
+          <w:tcPr>
+            <w:tcW w:type="dxa" w:w="3120"/>
+            <w:tcMar>
+              <w:top w:w="90" w:type="dxa"/>
+              <w:bottom w:w="90" w:type="dxa"/>
+              <w:left w:w="120" w:type="dxa"/>
+              <w:right w:w="120" w:type="dxa"/>
+            </w:tcMar>
+          </w:tcPr>
+          <w:p>
+            <w:pPr>
+              <w:jc w:val="right"/>
+            </w:pPr>
+            <w:r>
+              <w:rPr>
+                <w:rFonts w:ascii="Times New Roman" w:hAnsi="Times New Roman"/>
+                <w:b/>
+                <w:sz w:val="25"/>
+              </w:rPr>
+              <w:t>Page No.</w:t>
+            </w:r>
+          </w:p>
+        </w:tc>
+      </w:tr>
+      <w:tr>
+        <w:tc>
+          <w:tcPr>
+            <w:tcW w:type="dxa" w:w="1152"/>
+            <w:tcMar>
+              <w:top w:w="60" w:type="dxa"/>
+              <w:bottom w:w="60" w:type="dxa"/>
               <w:left w:w="100" w:type="dxa"/>
               <w:right w:w="100" w:type="dxa"/>
             </w:tcMar>
@@ -286,19 +389,18 @@
             <w:r>
               <w:rPr>
                 <w:rFonts w:ascii="Times New Roman" w:hAnsi="Times New Roman"/>
-                <w:b/>
-                <w:sz w:val="22"/>
+                <w:sz w:val="23"/>
               </w:rPr>
-              <w:t>S.No.</w:t>
+              <w:t>1</w:t>
             </w:r>
           </w:p>
         </w:tc>
         <w:tc>
           <w:tcPr>
-            <w:tcW w:type="dxa" w:w="3120"/>
+            <w:tcW w:type="dxa" w:w="6768"/>
             <w:tcMar>
-              <w:top w:w="80" w:type="dxa"/>
-              <w:bottom w:w="80" w:type="dxa"/>
+              <w:top w:w="60" w:type="dxa"/>
+              <w:bottom w:w="60" w:type="dxa"/>
               <w:left w:w="100" w:type="dxa"/>
               <w:right w:w="100" w:type="dxa"/>
             </w:tcMar>
@@ -307,19 +409,18 @@
             <w:r>
               <w:rPr>
                 <w:rFonts w:ascii="Times New Roman" w:hAnsi="Times New Roman"/>
-                <w:b/>
-                <w:sz w:val="22"/>
+                <w:sz w:val="23"/>
               </w:rPr>
-              <w:t>Table of Contents</w:t>
+              <w:t>Cover Page and Certificate</w:t>
             </w:r>
           </w:p>
         </w:tc>
         <w:tc>
           <w:tcPr>
-            <w:tcW w:type="dxa" w:w="3120"/>
+            <w:tcW w:type="dxa" w:w="1440"/>
             <w:tcMar>
-              <w:top w:w="80" w:type="dxa"/>
-              <w:bottom w:w="80" w:type="dxa"/>
+              <w:top w:w="60" w:type="dxa"/>
+              <w:bottom w:w="60" w:type="dxa"/>
               <w:left w:w="100" w:type="dxa"/>
               <w:right w:w="100" w:type="dxa"/>
             </w:tcMar>
@@ -331,76 +432,7 @@
             <w:r>
               <w:rPr>
                 <w:rFonts w:ascii="Times New Roman" w:hAnsi="Times New Roman"/>
-                <w:b/>
-                <w:sz w:val="22"/>
-              </w:rPr>
-              <w:t>Page No.</w:t>
-            </w:r>
-          </w:p>
-        </w:tc>
-      </w:tr>
-      <w:tr>
-        <w:tc>
-          <w:tcPr>
-            <w:tcW w:type="dxa" w:w="1152"/>
-            <w:tcMar>
-              <w:top w:w="50" w:type="dxa"/>
-              <w:bottom w:w="50" w:type="dxa"/>
-              <w:left w:w="80" w:type="dxa"/>
-              <w:right w:w="80" w:type="dxa"/>
-            </w:tcMar>
-          </w:tcPr>
-          <w:p>
-            <w:pPr>
-              <w:jc w:val="center"/>
-            </w:pPr>
-            <w:r>
-              <w:rPr>
-                <w:rFonts w:ascii="Times New Roman" w:hAnsi="Times New Roman"/>
-                <w:sz w:val="21"/>
-              </w:rPr>
-              <w:t>1</w:t>
-            </w:r>
-          </w:p>
-        </w:tc>
-        <w:tc>
-          <w:tcPr>
-            <w:tcW w:type="dxa" w:w="6768"/>
-            <w:tcMar>
-              <w:top w:w="50" w:type="dxa"/>
-              <w:bottom w:w="50" w:type="dxa"/>
-              <w:left w:w="80" w:type="dxa"/>
-              <w:right w:w="80" w:type="dxa"/>
-            </w:tcMar>
-          </w:tcPr>
-          <w:p>
-            <w:r>
-              <w:rPr>
-                <w:rFonts w:ascii="Times New Roman" w:hAnsi="Times New Roman"/>
-                <w:sz w:val="21"/>
-              </w:rPr>
-              <w:t>Cover Page and Certificate</w:t>
-            </w:r>
-          </w:p>
-        </w:tc>
-        <w:tc>
-          <w:tcPr>
-            <w:tcW w:type="dxa" w:w="1440"/>
-            <w:tcMar>
-              <w:top w:w="50" w:type="dxa"/>
-              <w:bottom w:w="50" w:type="dxa"/>
-              <w:left w:w="80" w:type="dxa"/>
-              <w:right w:w="80" w:type="dxa"/>
-            </w:tcMar>
-          </w:tcPr>
-          <w:p>
-            <w:pPr>
-              <w:jc w:val="right"/>
-            </w:pPr>
-            <w:r>
-              <w:rPr>
-                <w:rFonts w:ascii="Times New Roman" w:hAnsi="Times New Roman"/>
-                <w:sz w:val="21"/>
+                <w:sz w:val="23"/>
               </w:rPr>
               <w:t>1 - 2</w:t>
             </w:r>
@@ -412,10 +444,10 @@
           <w:tcPr>
             <w:tcW w:type="dxa" w:w="1152"/>
             <w:tcMar>
-              <w:top w:w="50" w:type="dxa"/>
-              <w:bottom w:w="50" w:type="dxa"/>
-              <w:left w:w="80" w:type="dxa"/>
-              <w:right w:w="80" w:type="dxa"/>
+              <w:top w:w="60" w:type="dxa"/>
+              <w:bottom w:w="60" w:type="dxa"/>
+              <w:left w:w="100" w:type="dxa"/>
+              <w:right w:w="100" w:type="dxa"/>
             </w:tcMar>
           </w:tcPr>
           <w:p>
@@ -425,7 +457,7 @@
             <w:r>
               <w:rPr>
                 <w:rFonts w:ascii="Times New Roman" w:hAnsi="Times New Roman"/>
-                <w:sz w:val="21"/>
+                <w:sz w:val="23"/>
               </w:rPr>
               <w:t>2</w:t>
             </w:r>
@@ -435,17 +467,17 @@
           <w:tcPr>
             <w:tcW w:type="dxa" w:w="6768"/>
             <w:tcMar>
-              <w:top w:w="50" w:type="dxa"/>
-              <w:bottom w:w="50" w:type="dxa"/>
-              <w:left w:w="80" w:type="dxa"/>
-              <w:right w:w="80" w:type="dxa"/>
+              <w:top w:w="60" w:type="dxa"/>
+              <w:bottom w:w="60" w:type="dxa"/>
+              <w:left w:w="100" w:type="dxa"/>
+              <w:right w:w="100" w:type="dxa"/>
             </w:tcMar>
           </w:tcPr>
           <w:p>
             <w:r>
               <w:rPr>
                 <w:rFonts w:ascii="Times New Roman" w:hAnsi="Times New Roman"/>
-                <w:sz w:val="21"/>
+                <w:sz w:val="23"/>
               </w:rPr>
               <w:t>Declaration and Acknowledgement</w:t>
             </w:r>
@@ -455,10 +487,10 @@
           <w:tcPr>
             <w:tcW w:type="dxa" w:w="1440"/>
             <w:tcMar>
-              <w:top w:w="50" w:type="dxa"/>
-              <w:bottom w:w="50" w:type="dxa"/>
-              <w:left w:w="80" w:type="dxa"/>
-              <w:right w:w="80" w:type="dxa"/>
+              <w:top w:w="60" w:type="dxa"/>
+              <w:bottom w:w="60" w:type="dxa"/>
+              <w:left w:w="100" w:type="dxa"/>
+              <w:right w:w="100" w:type="dxa"/>
             </w:tcMar>
           </w:tcPr>
           <w:p>
@@ -468,7 +500,7 @@
             <w:r>
               <w:rPr>
                 <w:rFonts w:ascii="Times New Roman" w:hAnsi="Times New Roman"/>
-                <w:sz w:val="21"/>
+                <w:sz w:val="23"/>
               </w:rPr>
               <w:t>3 - 4</w:t>
             </w:r>
@@ -480,10 +512,10 @@
           <w:tcPr>
             <w:tcW w:type="dxa" w:w="1152"/>
             <w:tcMar>
-              <w:top w:w="50" w:type="dxa"/>
-              <w:bottom w:w="50" w:type="dxa"/>
-              <w:left w:w="80" w:type="dxa"/>
-              <w:right w:w="80" w:type="dxa"/>
+              <w:top w:w="60" w:type="dxa"/>
+              <w:bottom w:w="60" w:type="dxa"/>
+              <w:left w:w="100" w:type="dxa"/>
+              <w:right w:w="100" w:type="dxa"/>
             </w:tcMar>
           </w:tcPr>
           <w:p>
@@ -493,7 +525,7 @@
             <w:r>
               <w:rPr>
                 <w:rFonts w:ascii="Times New Roman" w:hAnsi="Times New Roman"/>
-                <w:sz w:val="21"/>
+                <w:sz w:val="23"/>
               </w:rPr>
               <w:t>3</w:t>
             </w:r>
@@ -503,17 +535,17 @@
           <w:tcPr>
             <w:tcW w:type="dxa" w:w="6768"/>
             <w:tcMar>
-              <w:top w:w="50" w:type="dxa"/>
-              <w:bottom w:w="50" w:type="dxa"/>
-              <w:left w:w="80" w:type="dxa"/>
-              <w:right w:w="80" w:type="dxa"/>
+              <w:top w:w="60" w:type="dxa"/>
+              <w:bottom w:w="60" w:type="dxa"/>
+              <w:left w:w="100" w:type="dxa"/>
+              <w:right w:w="100" w:type="dxa"/>
             </w:tcMar>
           </w:tcPr>
           <w:p>
             <w:r>
               <w:rPr>
                 <w:rFonts w:ascii="Times New Roman" w:hAnsi="Times New Roman"/>
-                <w:sz w:val="21"/>
+                <w:sz w:val="23"/>
               </w:rPr>
               <w:t>Table of Contents</w:t>
             </w:r>
@@ -523,10 +555,10 @@
           <w:tcPr>
             <w:tcW w:type="dxa" w:w="1440"/>
             <w:tcMar>
-              <w:top w:w="50" w:type="dxa"/>
-              <w:bottom w:w="50" w:type="dxa"/>
-              <w:left w:w="80" w:type="dxa"/>
-              <w:right w:w="80" w:type="dxa"/>
+              <w:top w:w="60" w:type="dxa"/>
+              <w:bottom w:w="60" w:type="dxa"/>
+              <w:left w:w="100" w:type="dxa"/>
+              <w:right w:w="100" w:type="dxa"/>
             </w:tcMar>
           </w:tcPr>
           <w:p>
@@ -536,7 +568,7 @@
             <w:r>
               <w:rPr>
                 <w:rFonts w:ascii="Times New Roman" w:hAnsi="Times New Roman"/>
-                <w:sz w:val="21"/>
+                <w:sz w:val="23"/>
               </w:rPr>
               <w:t>5</w:t>
             </w:r>
@@ -548,10 +580,10 @@
           <w:tcPr>
             <w:tcW w:type="dxa" w:w="1152"/>
             <w:tcMar>
-              <w:top w:w="50" w:type="dxa"/>
-              <w:bottom w:w="50" w:type="dxa"/>
-              <w:left w:w="80" w:type="dxa"/>
-              <w:right w:w="80" w:type="dxa"/>
+              <w:top w:w="60" w:type="dxa"/>
+              <w:bottom w:w="60" w:type="dxa"/>
+              <w:left w:w="100" w:type="dxa"/>
+              <w:right w:w="100" w:type="dxa"/>
             </w:tcMar>
           </w:tcPr>
           <w:p>
@@ -561,7 +593,7 @@
             <w:r>
               <w:rPr>
                 <w:rFonts w:ascii="Times New Roman" w:hAnsi="Times New Roman"/>
-                <w:sz w:val="21"/>
+                <w:sz w:val="23"/>
               </w:rPr>
               <w:t>4</w:t>
             </w:r>
@@ -571,17 +603,17 @@
           <w:tcPr>
             <w:tcW w:type="dxa" w:w="6768"/>
             <w:tcMar>
-              <w:top w:w="50" w:type="dxa"/>
-              <w:bottom w:w="50" w:type="dxa"/>
-              <w:left w:w="80" w:type="dxa"/>
-              <w:right w:w="80" w:type="dxa"/>
+              <w:top w:w="60" w:type="dxa"/>
+              <w:bottom w:w="60" w:type="dxa"/>
+              <w:left w:w="100" w:type="dxa"/>
+              <w:right w:w="100" w:type="dxa"/>
             </w:tcMar>
           </w:tcPr>
           <w:p>
             <w:r>
               <w:rPr>
                 <w:rFonts w:ascii="Times New Roman" w:hAnsi="Times New Roman"/>
-                <w:sz w:val="21"/>
+                <w:sz w:val="23"/>
               </w:rPr>
               <w:t>1. Project Title</w:t>
             </w:r>
@@ -591,10 +623,10 @@
           <w:tcPr>
             <w:tcW w:type="dxa" w:w="1440"/>
             <w:tcMar>
-              <w:top w:w="50" w:type="dxa"/>
-              <w:bottom w:w="50" w:type="dxa"/>
-              <w:left w:w="80" w:type="dxa"/>
-              <w:right w:w="80" w:type="dxa"/>
+              <w:top w:w="60" w:type="dxa"/>
+              <w:bottom w:w="60" w:type="dxa"/>
+              <w:left w:w="100" w:type="dxa"/>
+              <w:right w:w="100" w:type="dxa"/>
             </w:tcMar>
           </w:tcPr>
           <w:p>
@@ -604,7 +636,7 @@
             <w:r>
               <w:rPr>
                 <w:rFonts w:ascii="Times New Roman" w:hAnsi="Times New Roman"/>
-                <w:sz w:val="21"/>
+                <w:sz w:val="23"/>
               </w:rPr>
               <w:t>6</w:t>
             </w:r>
@@ -616,10 +648,10 @@
           <w:tcPr>
             <w:tcW w:type="dxa" w:w="1152"/>
             <w:tcMar>
-              <w:top w:w="50" w:type="dxa"/>
-              <w:bottom w:w="50" w:type="dxa"/>
-              <w:left w:w="80" w:type="dxa"/>
-              <w:right w:w="80" w:type="dxa"/>
+              <w:top w:w="60" w:type="dxa"/>
+              <w:bottom w:w="60" w:type="dxa"/>
+              <w:left w:w="100" w:type="dxa"/>
+              <w:right w:w="100" w:type="dxa"/>
             </w:tcMar>
           </w:tcPr>
           <w:p>
@@ -629,7 +661,7 @@
             <w:r>
               <w:rPr>
                 <w:rFonts w:ascii="Times New Roman" w:hAnsi="Times New Roman"/>
-                <w:sz w:val="21"/>
+                <w:sz w:val="23"/>
               </w:rPr>
               <w:t>5</w:t>
             </w:r>
@@ -639,17 +671,17 @@
           <w:tcPr>
             <w:tcW w:type="dxa" w:w="6768"/>
             <w:tcMar>
-              <w:top w:w="50" w:type="dxa"/>
-              <w:bottom w:w="50" w:type="dxa"/>
-              <w:left w:w="80" w:type="dxa"/>
-              <w:right w:w="80" w:type="dxa"/>
+              <w:top w:w="60" w:type="dxa"/>
+              <w:bottom w:w="60" w:type="dxa"/>
+              <w:left w:w="100" w:type="dxa"/>
+              <w:right w:w="100" w:type="dxa"/>
             </w:tcMar>
           </w:tcPr>
           <w:p>
             <w:r>
               <w:rPr>
                 <w:rFonts w:ascii="Times New Roman" w:hAnsi="Times New Roman"/>
-                <w:sz w:val="21"/>
+                <w:sz w:val="23"/>
               </w:rPr>
               <w:t>2. Problem Statement</w:t>
             </w:r>
@@ -659,10 +691,10 @@
           <w:tcPr>
             <w:tcW w:type="dxa" w:w="1440"/>
             <w:tcMar>
-              <w:top w:w="50" w:type="dxa"/>
-              <w:bottom w:w="50" w:type="dxa"/>
-              <w:left w:w="80" w:type="dxa"/>
-              <w:right w:w="80" w:type="dxa"/>
+              <w:top w:w="60" w:type="dxa"/>
+              <w:bottom w:w="60" w:type="dxa"/>
+              <w:left w:w="100" w:type="dxa"/>
+              <w:right w:w="100" w:type="dxa"/>
             </w:tcMar>
           </w:tcPr>
           <w:p>
@@ -672,7 +704,7 @@
             <w:r>
               <w:rPr>
                 <w:rFonts w:ascii="Times New Roman" w:hAnsi="Times New Roman"/>
-                <w:sz w:val="21"/>
+                <w:sz w:val="23"/>
               </w:rPr>
               <w:t>6</w:t>
             </w:r>
@@ -684,10 +716,10 @@
           <w:tcPr>
             <w:tcW w:type="dxa" w:w="1152"/>
             <w:tcMar>
-              <w:top w:w="50" w:type="dxa"/>
-              <w:bottom w:w="50" w:type="dxa"/>
-              <w:left w:w="80" w:type="dxa"/>
-              <w:right w:w="80" w:type="dxa"/>
+              <w:top w:w="60" w:type="dxa"/>
+              <w:bottom w:w="60" w:type="dxa"/>
+              <w:left w:w="100" w:type="dxa"/>
+              <w:right w:w="100" w:type="dxa"/>
             </w:tcMar>
           </w:tcPr>
           <w:p>
@@ -697,7 +729,7 @@
             <w:r>
               <w:rPr>
                 <w:rFonts w:ascii="Times New Roman" w:hAnsi="Times New Roman"/>
-                <w:sz w:val="21"/>
+                <w:sz w:val="23"/>
               </w:rPr>
               <w:t>6</w:t>
             </w:r>
@@ -707,17 +739,17 @@
           <w:tcPr>
             <w:tcW w:type="dxa" w:w="6768"/>
             <w:tcMar>
-              <w:top w:w="50" w:type="dxa"/>
-              <w:bottom w:w="50" w:type="dxa"/>
-              <w:left w:w="80" w:type="dxa"/>
-              <w:right w:w="80" w:type="dxa"/>
+              <w:top w:w="60" w:type="dxa"/>
+              <w:bottom w:w="60" w:type="dxa"/>
+              <w:left w:w="100" w:type="dxa"/>
+              <w:right w:w="100" w:type="dxa"/>
             </w:tcMar>
           </w:tcPr>
           <w:p>
             <w:r>
               <w:rPr>
                 <w:rFonts w:ascii="Times New Roman" w:hAnsi="Times New Roman"/>
-                <w:sz w:val="21"/>
+                <w:sz w:val="23"/>
               </w:rPr>
               <w:t>3. Objectives of the Project</w:t>
             </w:r>
@@ -727,10 +759,10 @@
           <w:tcPr>
             <w:tcW w:type="dxa" w:w="1440"/>
             <w:tcMar>
-              <w:top w:w="50" w:type="dxa"/>
-              <w:bottom w:w="50" w:type="dxa"/>
-              <w:left w:w="80" w:type="dxa"/>
-              <w:right w:w="80" w:type="dxa"/>
+              <w:top w:w="60" w:type="dxa"/>
+              <w:bottom w:w="60" w:type="dxa"/>
+              <w:left w:w="100" w:type="dxa"/>
+              <w:right w:w="100" w:type="dxa"/>
             </w:tcMar>
           </w:tcPr>
           <w:p>
@@ -740,9 +772,9 @@
             <w:r>
               <w:rPr>
                 <w:rFonts w:ascii="Times New Roman" w:hAnsi="Times New Roman"/>
-                <w:sz w:val="21"/>
+                <w:sz w:val="23"/>
               </w:rPr>
-              <w:t>7</w:t>
+              <w:t>6 - 7</w:t>
             </w:r>
           </w:p>
         </w:tc>
@@ -752,10 +784,10 @@
           <w:tcPr>
             <w:tcW w:type="dxa" w:w="1152"/>
             <w:tcMar>
-              <w:top w:w="50" w:type="dxa"/>
-              <w:bottom w:w="50" w:type="dxa"/>
-              <w:left w:w="80" w:type="dxa"/>
-              <w:right w:w="80" w:type="dxa"/>
+              <w:top w:w="60" w:type="dxa"/>
+              <w:bottom w:w="60" w:type="dxa"/>
+              <w:left w:w="100" w:type="dxa"/>
+              <w:right w:w="100" w:type="dxa"/>
             </w:tcMar>
           </w:tcPr>
           <w:p>
@@ -765,7 +797,7 @@
             <w:r>
               <w:rPr>
                 <w:rFonts w:ascii="Times New Roman" w:hAnsi="Times New Roman"/>
-                <w:sz w:val="21"/>
+                <w:sz w:val="23"/>
               </w:rPr>
               <w:t>7</w:t>
             </w:r>
@@ -775,17 +807,17 @@
           <w:tcPr>
             <w:tcW w:type="dxa" w:w="6768"/>
             <w:tcMar>
-              <w:top w:w="50" w:type="dxa"/>
-              <w:bottom w:w="50" w:type="dxa"/>
-              <w:left w:w="80" w:type="dxa"/>
-              <w:right w:w="80" w:type="dxa"/>
+              <w:top w:w="60" w:type="dxa"/>
+              <w:bottom w:w="60" w:type="dxa"/>
+              <w:left w:w="100" w:type="dxa"/>
+              <w:right w:w="100" w:type="dxa"/>
             </w:tcMar>
           </w:tcPr>
           <w:p>
             <w:r>
               <w:rPr>
                 <w:rFonts w:ascii="Times New Roman" w:hAnsi="Times New Roman"/>
-                <w:sz w:val="21"/>
+                <w:sz w:val="23"/>
               </w:rPr>
               <w:t>4. Dataset Description</w:t>
             </w:r>
@@ -795,10 +827,10 @@
           <w:tcPr>
             <w:tcW w:type="dxa" w:w="1440"/>
             <w:tcMar>
-              <w:top w:w="50" w:type="dxa"/>
-              <w:bottom w:w="50" w:type="dxa"/>
-              <w:left w:w="80" w:type="dxa"/>
-              <w:right w:w="80" w:type="dxa"/>
+              <w:top w:w="60" w:type="dxa"/>
+              <w:bottom w:w="60" w:type="dxa"/>
+              <w:left w:w="100" w:type="dxa"/>
+              <w:right w:w="100" w:type="dxa"/>
             </w:tcMar>
           </w:tcPr>
           <w:p>
@@ -808,7 +840,75 @@
             <w:r>
               <w:rPr>
                 <w:rFonts w:ascii="Times New Roman" w:hAnsi="Times New Roman"/>
-                <w:sz w:val="21"/>
+                <w:sz w:val="23"/>
+              </w:rPr>
+              <w:t>7 - 8</w:t>
+            </w:r>
+          </w:p>
+        </w:tc>
+      </w:tr>
+      <w:tr>
+        <w:tc>
+          <w:tcPr>
+            <w:tcW w:type="dxa" w:w="1152"/>
+            <w:tcMar>
+              <w:top w:w="60" w:type="dxa"/>
+              <w:bottom w:w="60" w:type="dxa"/>
+              <w:left w:w="100" w:type="dxa"/>
+              <w:right w:w="100" w:type="dxa"/>
+            </w:tcMar>
+          </w:tcPr>
+          <w:p>
+            <w:pPr>
+              <w:jc w:val="center"/>
+            </w:pPr>
+            <w:r>
+              <w:rPr>
+                <w:rFonts w:ascii="Times New Roman" w:hAnsi="Times New Roman"/>
+                <w:sz w:val="23"/>
+              </w:rPr>
+              <w:t>8</w:t>
+            </w:r>
+          </w:p>
+        </w:tc>
+        <w:tc>
+          <w:tcPr>
+            <w:tcW w:type="dxa" w:w="6768"/>
+            <w:tcMar>
+              <w:top w:w="60" w:type="dxa"/>
+              <w:bottom w:w="60" w:type="dxa"/>
+              <w:left w:w="100" w:type="dxa"/>
+              <w:right w:w="100" w:type="dxa"/>
+            </w:tcMar>
+          </w:tcPr>
+          <w:p>
+            <w:r>
+              <w:rPr>
+                <w:rFonts w:ascii="Times New Roman" w:hAnsi="Times New Roman"/>
+                <w:sz w:val="23"/>
+              </w:rPr>
+              <w:t>5. Dataset Source</w:t>
+            </w:r>
+          </w:p>
+        </w:tc>
+        <w:tc>
+          <w:tcPr>
+            <w:tcW w:type="dxa" w:w="1440"/>
+            <w:tcMar>
+              <w:top w:w="60" w:type="dxa"/>
+              <w:bottom w:w="60" w:type="dxa"/>
+              <w:left w:w="100" w:type="dxa"/>
+              <w:right w:w="100" w:type="dxa"/>
+            </w:tcMar>
+          </w:tcPr>
+          <w:p>
+            <w:pPr>
+              <w:jc w:val="right"/>
+            </w:pPr>
+            <w:r>
+              <w:rPr>
+                <w:rFonts w:ascii="Times New Roman" w:hAnsi="Times New Roman"/>
+                <w:sz w:val="23"/>
               </w:rPr>
               <w:t>8</w:t>
             </w:r>
@@ -820,10 +920,10 @@
           <w:tcPr>
             <w:tcW w:type="dxa" w:w="1152"/>
             <w:tcMar>
-              <w:top w:w="50" w:type="dxa"/>
-              <w:bottom w:w="50" w:type="dxa"/>
-              <w:left w:w="80" w:type="dxa"/>
-              <w:right w:w="80" w:type="dxa"/>
+              <w:top w:w="60" w:type="dxa"/>
+              <w:bottom w:w="60" w:type="dxa"/>
+              <w:left w:w="100" w:type="dxa"/>
+              <w:right w:w="100" w:type="dxa"/>
             </w:tcMar>
           </w:tcPr>
           <w:p>
@@ -833,9 +933,9 @@
             <w:r>
               <w:rPr>
                 <w:rFonts w:ascii="Times New Roman" w:hAnsi="Times New Roman"/>
-                <w:sz w:val="21"/>
+                <w:sz w:val="23"/>
               </w:rPr>
-              <w:t>8</w:t>
+              <w:t>9</w:t>
             </w:r>
           </w:p>
         </w:tc>
@@ -843,19 +943,19 @@
           <w:tcPr>
             <w:tcW w:type="dxa" w:w="6768"/>
             <w:tcMar>
-              <w:top w:w="50" w:type="dxa"/>
-              <w:bottom w:w="50" w:type="dxa"/>
-              <w:left w:w="80" w:type="dxa"/>
-              <w:right w:w="80" w:type="dxa"/>
+              <w:top w:w="60" w:type="dxa"/>
+              <w:bottom w:w="60" w:type="dxa"/>
+              <w:left w:w="100" w:type="dxa"/>
+              <w:right w:w="100" w:type="dxa"/>
             </w:tcMar>
           </w:tcPr>
           <w:p>
             <w:r>
               <w:rPr>
                 <w:rFonts w:ascii="Times New Roman" w:hAnsi="Times New Roman"/>
-                <w:sz w:val="21"/>
+                <w:sz w:val="23"/>
               </w:rPr>
-              <w:t>5. Dataset Source</w:t>
+              <w:t>6. Tools &amp; Technologies Used</w:t>
             </w:r>
           </w:p>
         </w:tc>
@@ -863,10 +963,10 @@
           <w:tcPr>
             <w:tcW w:type="dxa" w:w="1440"/>
             <w:tcMar>
-              <w:top w:w="50" w:type="dxa"/>
-              <w:bottom w:w="50" w:type="dxa"/>
-              <w:left w:w="80" w:type="dxa"/>
-              <w:right w:w="80" w:type="dxa"/>
+              <w:top w:w="60" w:type="dxa"/>
+              <w:bottom w:w="60" w:type="dxa"/>
+              <w:left w:w="100" w:type="dxa"/>
+              <w:right w:w="100" w:type="dxa"/>
             </w:tcMar>
           </w:tcPr>
           <w:p>
@@ -876,7 +976,7 @@
             <w:r>
               <w:rPr>
                 <w:rFonts w:ascii="Times New Roman" w:hAnsi="Times New Roman"/>
-                <w:sz w:val="21"/>
+                <w:sz w:val="23"/>
               </w:rPr>
               <w:t>9</w:t>
             </w:r>
@@ -888,10 +988,10 @@
           <w:tcPr>
             <w:tcW w:type="dxa" w:w="1152"/>
             <w:tcMar>
-              <w:top w:w="50" w:type="dxa"/>
-              <w:bottom w:w="50" w:type="dxa"/>
-              <w:left w:w="80" w:type="dxa"/>
-              <w:right w:w="80" w:type="dxa"/>
+              <w:top w:w="60" w:type="dxa"/>
+              <w:bottom w:w="60" w:type="dxa"/>
+              <w:left w:w="100" w:type="dxa"/>
+              <w:right w:w="100" w:type="dxa"/>
             </w:tcMar>
           </w:tcPr>
           <w:p>
@@ -901,9 +1001,9 @@
             <w:r>
               <w:rPr>
                 <w:rFonts w:ascii="Times New Roman" w:hAnsi="Times New Roman"/>
-                <w:sz w:val="21"/>
+                <w:sz w:val="23"/>
               </w:rPr>
-              <w:t>9</w:t>
+              <w:t>10</w:t>
             </w:r>
           </w:p>
         </w:tc>
@@ -911,19 +1011,19 @@
           <w:tcPr>
             <w:tcW w:type="dxa" w:w="6768"/>
             <w:tcMar>
-              <w:top w:w="50" w:type="dxa"/>
-              <w:bottom w:w="50" w:type="dxa"/>
-              <w:left w:w="80" w:type="dxa"/>
-              <w:right w:w="80" w:type="dxa"/>
+              <w:top w:w="60" w:type="dxa"/>
+              <w:bottom w:w="60" w:type="dxa"/>
+              <w:left w:w="100" w:type="dxa"/>
+              <w:right w:w="100" w:type="dxa"/>
             </w:tcMar>
           </w:tcPr>
           <w:p>
             <w:r>
               <w:rPr>
                 <w:rFonts w:ascii="Times New Roman" w:hAnsi="Times New Roman"/>
-                <w:sz w:val="21"/>
+                <w:sz w:val="23"/>
               </w:rPr>
-              <w:t>6. Tools &amp; Technologies Used</w:t>
+              <w:t>7. Implementation / Methodology</w:t>
             </w:r>
           </w:p>
         </w:tc>
@@ -931,10 +1031,10 @@
           <w:tcPr>
             <w:tcW w:type="dxa" w:w="1440"/>
             <w:tcMar>
-              <w:top w:w="50" w:type="dxa"/>
-              <w:bottom w:w="50" w:type="dxa"/>
-              <w:left w:w="80" w:type="dxa"/>
-              <w:right w:w="80" w:type="dxa"/>
+              <w:top w:w="60" w:type="dxa"/>
+              <w:bottom w:w="60" w:type="dxa"/>
+              <w:left w:w="100" w:type="dxa"/>
+              <w:right w:w="100" w:type="dxa"/>
             </w:tcMar>
           </w:tcPr>
           <w:p>
@@ -944,9 +1044,9 @@
             <w:r>
               <w:rPr>
                 <w:rFonts w:ascii="Times New Roman" w:hAnsi="Times New Roman"/>
-                <w:sz w:val="21"/>
+                <w:sz w:val="23"/>
               </w:rPr>
-              <w:t>10</w:t>
+              <w:t>9 - 10</w:t>
             </w:r>
           </w:p>
         </w:tc>
@@ -956,10 +1056,10 @@
           <w:tcPr>
             <w:tcW w:type="dxa" w:w="1152"/>
             <w:tcMar>
-              <w:top w:w="50" w:type="dxa"/>
-              <w:bottom w:w="50" w:type="dxa"/>
-              <w:left w:w="80" w:type="dxa"/>
-              <w:right w:w="80" w:type="dxa"/>
+              <w:top w:w="60" w:type="dxa"/>
+              <w:bottom w:w="60" w:type="dxa"/>
+              <w:left w:w="100" w:type="dxa"/>
+              <w:right w:w="100" w:type="dxa"/>
             </w:tcMar>
           </w:tcPr>
           <w:p>
@@ -969,9 +1069,9 @@
             <w:r>
               <w:rPr>
                 <w:rFonts w:ascii="Times New Roman" w:hAnsi="Times New Roman"/>
-                <w:sz w:val="21"/>
+                <w:sz w:val="23"/>
               </w:rPr>
-              <w:t>10</w:t>
+              <w:t>11</w:t>
             </w:r>
           </w:p>
         </w:tc>
@@ -979,19 +1079,19 @@
           <w:tcPr>
             <w:tcW w:type="dxa" w:w="6768"/>
             <w:tcMar>
-              <w:top w:w="50" w:type="dxa"/>
-              <w:bottom w:w="50" w:type="dxa"/>
-              <w:left w:w="80" w:type="dxa"/>
-              <w:right w:w="80" w:type="dxa"/>
+              <w:top w:w="60" w:type="dxa"/>
+              <w:bottom w:w="60" w:type="dxa"/>
+              <w:left w:w="100" w:type="dxa"/>
+              <w:right w:w="100" w:type="dxa"/>
             </w:tcMar>
           </w:tcPr>
           <w:p>
             <w:r>
               <w:rPr>
                 <w:rFonts w:ascii="Times New Roman" w:hAnsi="Times New Roman"/>
-                <w:sz w:val="21"/>
+                <w:sz w:val="23"/>
               </w:rPr>
-              <w:t>7. Implementation / Methodology</w:t>
+              <w:t>8. Complete Source Code (With GitHub Link)</w:t>
             </w:r>
           </w:p>
         </w:tc>
@@ -999,10 +1099,10 @@
           <w:tcPr>
             <w:tcW w:type="dxa" w:w="1440"/>
             <w:tcMar>
-              <w:top w:w="50" w:type="dxa"/>
-              <w:bottom w:w="50" w:type="dxa"/>
-              <w:left w:w="80" w:type="dxa"/>
-              <w:right w:w="80" w:type="dxa"/>
+              <w:top w:w="60" w:type="dxa"/>
+              <w:bottom w:w="60" w:type="dxa"/>
+              <w:left w:w="100" w:type="dxa"/>
+              <w:right w:w="100" w:type="dxa"/>
             </w:tcMar>
           </w:tcPr>
           <w:p>
@@ -1012,9 +1112,9 @@
             <w:r>
               <w:rPr>
                 <w:rFonts w:ascii="Times New Roman" w:hAnsi="Times New Roman"/>
-                <w:sz w:val="21"/>
+                <w:sz w:val="23"/>
               </w:rPr>
-              <w:t>11 - 13</w:t>
+              <w:t>11 - 17</w:t>
             </w:r>
           </w:p>
         </w:tc>
@@ -1024,10 +1124,10 @@
           <w:tcPr>
             <w:tcW w:type="dxa" w:w="1152"/>
             <w:tcMar>
-              <w:top w:w="50" w:type="dxa"/>
-              <w:bottom w:w="50" w:type="dxa"/>
-              <w:left w:w="80" w:type="dxa"/>
-              <w:right w:w="80" w:type="dxa"/>
+              <w:top w:w="60" w:type="dxa"/>
+              <w:bottom w:w="60" w:type="dxa"/>
+              <w:left w:w="100" w:type="dxa"/>
+              <w:right w:w="100" w:type="dxa"/>
             </w:tcMar>
           </w:tcPr>
           <w:p>
@@ -1037,9 +1137,9 @@
             <w:r>
               <w:rPr>
                 <w:rFonts w:ascii="Times New Roman" w:hAnsi="Times New Roman"/>
-                <w:sz w:val="21"/>
+                <w:sz w:val="23"/>
               </w:rPr>
-              <w:t>11</w:t>
+              <w:t>12</w:t>
             </w:r>
           </w:p>
         </w:tc>
@@ -1047,19 +1147,19 @@
           <w:tcPr>
             <w:tcW w:type="dxa" w:w="6768"/>
             <w:tcMar>
-              <w:top w:w="50" w:type="dxa"/>
-              <w:bottom w:w="50" w:type="dxa"/>
-              <w:left w:w="80" w:type="dxa"/>
-              <w:right w:w="80" w:type="dxa"/>
+              <w:top w:w="60" w:type="dxa"/>
+              <w:bottom w:w="60" w:type="dxa"/>
+              <w:left w:w="100" w:type="dxa"/>
+              <w:right w:w="100" w:type="dxa"/>
             </w:tcMar>
           </w:tcPr>
           <w:p>
             <w:r>
               <w:rPr>
                 <w:rFonts w:ascii="Times New Roman" w:hAnsi="Times New Roman"/>
-                <w:sz w:val="21"/>
+                <w:sz w:val="23"/>
               </w:rPr>
-              <w:t>8. Complete Source Code</w:t>
+              <w:t>9. Execution Screenshots &amp; Recorded Outputs</w:t>
             </w:r>
           </w:p>
         </w:tc>
@@ -1067,10 +1167,10 @@
           <w:tcPr>
             <w:tcW w:type="dxa" w:w="1440"/>
             <w:tcMar>
-              <w:top w:w="50" w:type="dxa"/>
-              <w:bottom w:w="50" w:type="dxa"/>
-              <w:left w:w="80" w:type="dxa"/>
-              <w:right w:w="80" w:type="dxa"/>
+              <w:top w:w="60" w:type="dxa"/>
+              <w:bottom w:w="60" w:type="dxa"/>
+              <w:left w:w="100" w:type="dxa"/>
+              <w:right w:w="100" w:type="dxa"/>
             </w:tcMar>
           </w:tcPr>
           <w:p>
@@ -1080,9 +1180,9 @@
             <w:r>
               <w:rPr>
                 <w:rFonts w:ascii="Times New Roman" w:hAnsi="Times New Roman"/>
-                <w:sz w:val="21"/>
+                <w:sz w:val="23"/>
               </w:rPr>
-              <w:t>14 - 17</w:t>
+              <w:t>17 - 19</w:t>
             </w:r>
           </w:p>
         </w:tc>
@@ -1092,10 +1192,10 @@
           <w:tcPr>
             <w:tcW w:type="dxa" w:w="1152"/>
             <w:tcMar>
-              <w:top w:w="50" w:type="dxa"/>
-              <w:bottom w:w="50" w:type="dxa"/>
-              <w:left w:w="80" w:type="dxa"/>
-              <w:right w:w="80" w:type="dxa"/>
+              <w:top w:w="60" w:type="dxa"/>
+              <w:bottom w:w="60" w:type="dxa"/>
+              <w:left w:w="100" w:type="dxa"/>
+              <w:right w:w="100" w:type="dxa"/>
             </w:tcMar>
           </w:tcPr>
           <w:p>
@@ -1105,9 +1205,9 @@
             <w:r>
               <w:rPr>
                 <w:rFonts w:ascii="Times New Roman" w:hAnsi="Times New Roman"/>
-                <w:sz w:val="21"/>
+                <w:sz w:val="23"/>
               </w:rPr>
-              <w:t>12</w:t>
+              <w:t>13</w:t>
             </w:r>
           </w:p>
         </w:tc>
@@ -1115,19 +1215,19 @@
           <w:tcPr>
             <w:tcW w:type="dxa" w:w="6768"/>
             <w:tcMar>
-              <w:top w:w="50" w:type="dxa"/>
-              <w:bottom w:w="50" w:type="dxa"/>
-              <w:left w:w="80" w:type="dxa"/>
-              <w:right w:w="80" w:type="dxa"/>
+              <w:top w:w="60" w:type="dxa"/>
+              <w:bottom w:w="60" w:type="dxa"/>
+              <w:left w:w="100" w:type="dxa"/>
+              <w:right w:w="100" w:type="dxa"/>
             </w:tcMar>
           </w:tcPr>
           <w:p>
             <w:r>
               <w:rPr>
                 <w:rFonts w:ascii="Times New Roman" w:hAnsi="Times New Roman"/>
-                <w:sz w:val="21"/>
+                <w:sz w:val="23"/>
               </w:rPr>
-              <w:t>9. Execution Screenshots &amp; Recorded Outputs</w:t>
+              <w:t>10. Output / Result Screenshots (Charts &amp; Plots)</w:t>
             </w:r>
           </w:p>
         </w:tc>
@@ -1135,10 +1235,10 @@
           <w:tcPr>
             <w:tcW w:type="dxa" w:w="1440"/>
             <w:tcMar>
-              <w:top w:w="50" w:type="dxa"/>
-              <w:bottom w:w="50" w:type="dxa"/>
-              <w:left w:w="80" w:type="dxa"/>
-              <w:right w:w="80" w:type="dxa"/>
+              <w:top w:w="60" w:type="dxa"/>
+              <w:bottom w:w="60" w:type="dxa"/>
+              <w:left w:w="100" w:type="dxa"/>
+              <w:right w:w="100" w:type="dxa"/>
             </w:tcMar>
           </w:tcPr>
           <w:p>
@@ -1148,9 +1248,9 @@
             <w:r>
               <w:rPr>
                 <w:rFonts w:ascii="Times New Roman" w:hAnsi="Times New Roman"/>
-                <w:sz w:val="21"/>
+                <w:sz w:val="23"/>
               </w:rPr>
-              <w:t>18 - 19</w:t>
+              <w:t>19 - 22</w:t>
             </w:r>
           </w:p>
         </w:tc>
@@ -1160,10 +1260,10 @@
           <w:tcPr>
             <w:tcW w:type="dxa" w:w="1152"/>
             <w:tcMar>
-              <w:top w:w="50" w:type="dxa"/>
-              <w:bottom w:w="50" w:type="dxa"/>
-              <w:left w:w="80" w:type="dxa"/>
-              <w:right w:w="80" w:type="dxa"/>
+              <w:top w:w="60" w:type="dxa"/>
+              <w:bottom w:w="60" w:type="dxa"/>
+              <w:left w:w="100" w:type="dxa"/>
+              <w:right w:w="100" w:type="dxa"/>
             </w:tcMar>
           </w:tcPr>
           <w:p>
@@ -1173,9 +1273,9 @@
             <w:r>
               <w:rPr>
                 <w:rFonts w:ascii="Times New Roman" w:hAnsi="Times New Roman"/>
-                <w:sz w:val="21"/>
+                <w:sz w:val="23"/>
               </w:rPr>
-              <w:t>13</w:t>
+              <w:t>14</w:t>
             </w:r>
           </w:p>
         </w:tc>
@@ -1183,19 +1283,19 @@
           <w:tcPr>
             <w:tcW w:type="dxa" w:w="6768"/>
             <w:tcMar>
-              <w:top w:w="50" w:type="dxa"/>
-              <w:bottom w:w="50" w:type="dxa"/>
-              <w:left w:w="80" w:type="dxa"/>
-              <w:right w:w="80" w:type="dxa"/>
+              <w:top w:w="60" w:type="dxa"/>
+              <w:bottom w:w="60" w:type="dxa"/>
+              <w:left w:w="100" w:type="dxa"/>
+              <w:right w:w="100" w:type="dxa"/>
             </w:tcMar>
           </w:tcPr>
           <w:p>
             <w:r>
               <w:rPr>
                 <w:rFonts w:ascii="Times New Roman" w:hAnsi="Times New Roman"/>
-                <w:sz w:val="21"/>
+                <w:sz w:val="23"/>
               </w:rPr>
-              <w:t>10. Output / Result Screenshots (Charts &amp; Heatmaps)</w:t>
+              <w:t>11. Result Analysis</w:t>
             </w:r>
           </w:p>
         </w:tc>
@@ -1203,10 +1303,10 @@
           <w:tcPr>
             <w:tcW w:type="dxa" w:w="1440"/>
             <w:tcMar>
-              <w:top w:w="50" w:type="dxa"/>
-              <w:bottom w:w="50" w:type="dxa"/>
-              <w:left w:w="80" w:type="dxa"/>
-              <w:right w:w="80" w:type="dxa"/>
+              <w:top w:w="60" w:type="dxa"/>
+              <w:bottom w:w="60" w:type="dxa"/>
+              <w:left w:w="100" w:type="dxa"/>
+              <w:right w:w="100" w:type="dxa"/>
             </w:tcMar>
           </w:tcPr>
           <w:p>
@@ -1216,9 +1316,9 @@
             <w:r>
               <w:rPr>
                 <w:rFonts w:ascii="Times New Roman" w:hAnsi="Times New Roman"/>
-                <w:sz w:val="21"/>
+                <w:sz w:val="23"/>
               </w:rPr>
-              <w:t>20 - 22</w:t>
+              <w:t>22 - 23</w:t>
             </w:r>
           </w:p>
         </w:tc>
@@ -1228,10 +1328,10 @@
           <w:tcPr>
             <w:tcW w:type="dxa" w:w="1152"/>
             <w:tcMar>
-              <w:top w:w="50" w:type="dxa"/>
-              <w:bottom w:w="50" w:type="dxa"/>
-              <w:left w:w="80" w:type="dxa"/>
-              <w:right w:w="80" w:type="dxa"/>
+              <w:top w:w="60" w:type="dxa"/>
+              <w:bottom w:w="60" w:type="dxa"/>
+              <w:left w:w="100" w:type="dxa"/>
+              <w:right w:w="100" w:type="dxa"/>
             </w:tcMar>
           </w:tcPr>
           <w:p>
@@ -1241,9 +1341,9 @@
             <w:r>
               <w:rPr>
                 <w:rFonts w:ascii="Times New Roman" w:hAnsi="Times New Roman"/>
-                <w:sz w:val="21"/>
+                <w:sz w:val="23"/>
               </w:rPr>
-              <w:t>14</w:t>
+              <w:t>15</w:t>
             </w:r>
           </w:p>
         </w:tc>
@@ -1251,19 +1351,19 @@
           <w:tcPr>
             <w:tcW w:type="dxa" w:w="6768"/>
             <w:tcMar>
-              <w:top w:w="50" w:type="dxa"/>
-              <w:bottom w:w="50" w:type="dxa"/>
-              <w:left w:w="80" w:type="dxa"/>
-              <w:right w:w="80" w:type="dxa"/>
+              <w:top w:w="60" w:type="dxa"/>
+              <w:bottom w:w="60" w:type="dxa"/>
+              <w:left w:w="100" w:type="dxa"/>
+              <w:right w:w="100" w:type="dxa"/>
             </w:tcMar>
           </w:tcPr>
           <w:p>
             <w:r>
               <w:rPr>
                 <w:rFonts w:ascii="Times New Roman" w:hAnsi="Times New Roman"/>
-                <w:sz w:val="21"/>
+                <w:sz w:val="23"/>
               </w:rPr>
-              <w:t>11. Result Analysis</w:t>
+              <w:t>12. Conclusion &amp; References</w:t>
             </w:r>
           </w:p>
         </w:tc>
@@ -1271,10 +1371,10 @@
           <w:tcPr>
             <w:tcW w:type="dxa" w:w="1440"/>
             <w:tcMar>
-              <w:top w:w="50" w:type="dxa"/>
-              <w:bottom w:w="50" w:type="dxa"/>
-              <w:left w:w="80" w:type="dxa"/>
-              <w:right w:w="80" w:type="dxa"/>
+              <w:top w:w="60" w:type="dxa"/>
+              <w:bottom w:w="60" w:type="dxa"/>
+              <w:left w:w="100" w:type="dxa"/>
+              <w:right w:w="100" w:type="dxa"/>
             </w:tcMar>
           </w:tcPr>
           <w:p>
@@ -1284,77 +1384,9 @@
             <w:r>
               <w:rPr>
                 <w:rFonts w:ascii="Times New Roman" w:hAnsi="Times New Roman"/>
-                <w:sz w:val="21"/>
+                <w:sz w:val="23"/>
               </w:rPr>
               <w:t>23 - 24</w:t>
-            </w:r>
-          </w:p>
-        </w:tc>
-      </w:tr>
-      <w:tr>
-        <w:tc>
-          <w:tcPr>
-            <w:tcW w:type="dxa" w:w="1152"/>
-            <w:tcMar>
-              <w:top w:w="50" w:type="dxa"/>
-              <w:bottom w:w="50" w:type="dxa"/>
-              <w:left w:w="80" w:type="dxa"/>
-              <w:right w:w="80" w:type="dxa"/>
-            </w:tcMar>
-          </w:tcPr>
-          <w:p>
-            <w:pPr>
-              <w:jc w:val="center"/>
-            </w:pPr>
-            <w:r>
-              <w:rPr>
-                <w:rFonts w:ascii="Times New Roman" w:hAnsi="Times New Roman"/>
-                <w:sz w:val="21"/>
-              </w:rPr>
-              <w:t>15</w:t>
-            </w:r>
-          </w:p>
-        </w:tc>
-        <w:tc>
-          <w:tcPr>
-            <w:tcW w:type="dxa" w:w="6768"/>
-            <w:tcMar>
-              <w:top w:w="50" w:type="dxa"/>
-              <w:bottom w:w="50" w:type="dxa"/>
-              <w:left w:w="80" w:type="dxa"/>
-              <w:right w:w="80" w:type="dxa"/>
-            </w:tcMar>
-          </w:tcPr>
-          <w:p>
-            <w:r>
-              <w:rPr>
-                <w:rFonts w:ascii="Times New Roman" w:hAnsi="Times New Roman"/>
-                <w:sz w:val="21"/>
-              </w:rPr>
-              <w:t>12. Conclusion &amp; References</w:t>
-            </w:r>
-          </w:p>
-        </w:tc>
-        <w:tc>
-          <w:tcPr>
-            <w:tcW w:type="dxa" w:w="1440"/>
-            <w:tcMar>
-              <w:top w:w="50" w:type="dxa"/>
-              <w:bottom w:w="50" w:type="dxa"/>
-              <w:left w:w="80" w:type="dxa"/>
-              <w:right w:w="80" w:type="dxa"/>
-            </w:tcMar>
-          </w:tcPr>
-          <w:p>
-            <w:pPr>
-              <w:jc w:val="right"/>
-            </w:pPr>
-            <w:r>
-              <w:rPr>
-                <w:rFonts w:ascii="Times New Roman" w:hAnsi="Times New Roman"/>
-                <w:sz w:val="21"/>
-              </w:rPr>
-              <w:t>25</w:t>
             </w:r>
           </w:p>
         </w:tc>
@@ -1374,12 +1406,15 @@
         <w:rPr>
           <w:rFonts w:ascii="Times New Roman" w:hAnsi="Times New Roman"/>
           <w:b/>
-          <w:sz w:val="28"/>
+          <w:sz w:val="30"/>
         </w:rPr>
         <w:t>1. Project Title</w:t>
       </w:r>
     </w:p>
     <w:p>
+      <w:pPr>
+        <w:spacing w:after="160"/>
+      </w:pPr>
       <w:r>
         <w:t>Bank Transaction Fraud Detection and Analytics Using Apache Spark and PySpark analyzes large-scale financial transaction records from commercial banking operations and evaluates distributed machine-learning models using PySpark and Spark MLlib to identify fraudulent transactions and predict customer spending amounts across multiple transaction channels.</w:t>
       </w:r>
@@ -1393,7 +1428,7 @@
         <w:rPr>
           <w:rFonts w:ascii="Times New Roman" w:hAnsi="Times New Roman"/>
           <w:b/>
-          <w:sz w:val="28"/>
+          <w:sz w:val="30"/>
         </w:rPr>
         <w:t>2. Problem Statement</w:t>
       </w:r>
@@ -1428,7 +1463,7 @@
         <w:rPr>
           <w:rFonts w:ascii="Times New Roman" w:hAnsi="Times New Roman"/>
           <w:b/>
-          <w:sz w:val="28"/>
+          <w:sz w:val="30"/>
         </w:rPr>
         <w:t>3. Objectives of the Project</w:t>
       </w:r>
@@ -1441,7 +1476,7 @@
       <w:r>
         <w:rPr>
           <w:rFonts w:ascii="Times New Roman" w:hAnsi="Times New Roman"/>
-          <w:sz w:val="23"/>
+          <w:sz w:val="24"/>
         </w:rPr>
         <w:t>To ingest, inspect, and validate a large-scale bank transaction dataset of 200,000 records using distributed PySpark DataFrames.</w:t>
       </w:r>
@@ -1454,7 +1489,7 @@
       <w:r>
         <w:rPr>
           <w:rFonts w:ascii="Times New Roman" w:hAnsi="Times New Roman"/>
-          <w:sz w:val="23"/>
+          <w:sz w:val="24"/>
         </w:rPr>
         <w:t>To perform thorough data quality analysis, auditing null/missing values across all 24 columns and verifying duplicate records.</w:t>
       </w:r>
@@ -1467,7 +1502,7 @@
       <w:r>
         <w:rPr>
           <w:rFonts w:ascii="Times New Roman" w:hAnsi="Times New Roman"/>
-          <w:sz w:val="23"/>
+          <w:sz w:val="24"/>
         </w:rPr>
         <w:t>To conduct exploratory data analysis (EDA) to study transaction behavior across transaction types, merchant categories, and device channels.</w:t>
       </w:r>
@@ -1480,7 +1515,7 @@
       <w:r>
         <w:rPr>
           <w:rFonts w:ascii="Times New Roman" w:hAnsi="Times New Roman"/>
-          <w:sz w:val="23"/>
+          <w:sz w:val="24"/>
         </w:rPr>
         <w:t>To perform feature engineering by extracting temporal transaction hours from timestamps and filtering high-cardinality PII/UUIDs to prevent overfitting.</w:t>
       </w:r>
@@ -1493,7 +1528,7 @@
       <w:r>
         <w:rPr>
           <w:rFonts w:ascii="Times New Roman" w:hAnsi="Times New Roman"/>
-          <w:sz w:val="23"/>
+          <w:sz w:val="24"/>
         </w:rPr>
         <w:t>To compute numerical feature correlations and generate a Pearson Correlation Heatmap.</w:t>
       </w:r>
@@ -1506,7 +1541,7 @@
       <w:r>
         <w:rPr>
           <w:rFonts w:ascii="Times New Roman" w:hAnsi="Times New Roman"/>
-          <w:sz w:val="23"/>
+          <w:sz w:val="24"/>
         </w:rPr>
         <w:t>To apply unsupervised learning using K-Means Clustering with StandardScaler normalization and evaluate cluster compactness using the Silhouette Score.</w:t>
       </w:r>
@@ -1519,7 +1554,7 @@
       <w:r>
         <w:rPr>
           <w:rFonts w:ascii="Times New Roman" w:hAnsi="Times New Roman"/>
-          <w:sz w:val="23"/>
+          <w:sz w:val="24"/>
         </w:rPr>
         <w:t>To implement supervised regression using Linear Regression to predict Transaction_Amount, evaluated using R², RMSE, and MAE, along with an Actual vs. Predicted scatter plot.</w:t>
       </w:r>
@@ -1532,7 +1567,7 @@
       <w:r>
         <w:rPr>
           <w:rFonts w:ascii="Times New Roman" w:hAnsi="Times New Roman"/>
-          <w:sz w:val="23"/>
+          <w:sz w:val="24"/>
         </w:rPr>
         <w:t>To benchmark four supervised classification models for fraud detection (Is_Fraud): Logistic Regression, Decision Tree Classifier, Linear Support Vector Machine (SVM), and Gaussian Naive Bayes.</w:t>
       </w:r>
@@ -1545,7 +1580,7 @@
       <w:r>
         <w:rPr>
           <w:rFonts w:ascii="Times New Roman" w:hAnsi="Times New Roman"/>
-          <w:sz w:val="23"/>
+          <w:sz w:val="24"/>
         </w:rPr>
         <w:t>To evaluate classification performance using Accuracy, F1-Score, and a dynamically computed Confusion Matrix.</w:t>
       </w:r>
@@ -1558,7 +1593,7 @@
       <w:r>
         <w:rPr>
           <w:rFonts w:ascii="Times New Roman" w:hAnsi="Times New Roman"/>
-          <w:sz w:val="23"/>
+          <w:sz w:val="24"/>
         </w:rPr>
         <w:t>To establish an isolated runtime environment supporting Java 8 and Python 3.10 without disturbing the host machine's global configurations.</w:t>
       </w:r>
@@ -1572,7 +1607,7 @@
         <w:rPr>
           <w:rFonts w:ascii="Times New Roman" w:hAnsi="Times New Roman"/>
           <w:b/>
-          <w:sz w:val="28"/>
+          <w:sz w:val="30"/>
         </w:rPr>
         <w:t>4. Dataset Description</w:t>
       </w:r>
@@ -1607,10 +1642,10 @@
           <w:tcPr>
             <w:tcW w:type="dxa" w:w="2340"/>
             <w:tcMar>
-              <w:top w:w="60" w:type="dxa"/>
-              <w:bottom w:w="60" w:type="dxa"/>
-              <w:left w:w="80" w:type="dxa"/>
-              <w:right w:w="80" w:type="dxa"/>
+              <w:top w:w="80" w:type="dxa"/>
+              <w:bottom w:w="80" w:type="dxa"/>
+              <w:left w:w="100" w:type="dxa"/>
+              <w:right w:w="100" w:type="dxa"/>
             </w:tcMar>
           </w:tcPr>
           <w:p>
@@ -1618,7 +1653,7 @@
               <w:rPr>
                 <w:rFonts w:ascii="Times New Roman" w:hAnsi="Times New Roman"/>
                 <w:b/>
-                <w:sz w:val="20"/>
+                <w:sz w:val="24"/>
               </w:rPr>
               <w:t>Attribute Name</w:t>
             </w:r>
@@ -1628,10 +1663,10 @@
           <w:tcPr>
             <w:tcW w:type="dxa" w:w="2340"/>
             <w:tcMar>
-              <w:top w:w="60" w:type="dxa"/>
-              <w:bottom w:w="60" w:type="dxa"/>
-              <w:left w:w="80" w:type="dxa"/>
-              <w:right w:w="80" w:type="dxa"/>
+              <w:top w:w="80" w:type="dxa"/>
+              <w:bottom w:w="80" w:type="dxa"/>
+              <w:left w:w="100" w:type="dxa"/>
+              <w:right w:w="100" w:type="dxa"/>
             </w:tcMar>
           </w:tcPr>
           <w:p>
@@ -1639,7 +1674,7 @@
               <w:rPr>
                 <w:rFonts w:ascii="Times New Roman" w:hAnsi="Times New Roman"/>
                 <w:b/>
-                <w:sz w:val="20"/>
+                <w:sz w:val="24"/>
               </w:rPr>
               <w:t>Data Type</w:t>
             </w:r>
@@ -1649,10 +1684,10 @@
           <w:tcPr>
             <w:tcW w:type="dxa" w:w="2340"/>
             <w:tcMar>
-              <w:top w:w="60" w:type="dxa"/>
-              <w:bottom w:w="60" w:type="dxa"/>
-              <w:left w:w="80" w:type="dxa"/>
-              <w:right w:w="80" w:type="dxa"/>
+              <w:top w:w="80" w:type="dxa"/>
+              <w:bottom w:w="80" w:type="dxa"/>
+              <w:left w:w="100" w:type="dxa"/>
+              <w:right w:w="100" w:type="dxa"/>
             </w:tcMar>
           </w:tcPr>
           <w:p>
@@ -1660,7 +1695,7 @@
               <w:rPr>
                 <w:rFonts w:ascii="Times New Roman" w:hAnsi="Times New Roman"/>
                 <w:b/>
-                <w:sz w:val="20"/>
+                <w:sz w:val="24"/>
               </w:rPr>
               <w:t>Role in Project</w:t>
             </w:r>
@@ -1670,10 +1705,10 @@
           <w:tcPr>
             <w:tcW w:type="dxa" w:w="2340"/>
             <w:tcMar>
-              <w:top w:w="60" w:type="dxa"/>
-              <w:bottom w:w="60" w:type="dxa"/>
-              <w:left w:w="80" w:type="dxa"/>
-              <w:right w:w="80" w:type="dxa"/>
+              <w:top w:w="80" w:type="dxa"/>
+              <w:bottom w:w="80" w:type="dxa"/>
+              <w:left w:w="100" w:type="dxa"/>
+              <w:right w:w="100" w:type="dxa"/>
             </w:tcMar>
           </w:tcPr>
           <w:p>
@@ -1681,7 +1716,7 @@
               <w:rPr>
                 <w:rFonts w:ascii="Times New Roman" w:hAnsi="Times New Roman"/>
                 <w:b/>
-                <w:sz w:val="20"/>
+                <w:sz w:val="24"/>
               </w:rPr>
               <w:t>Description / Value Range</w:t>
             </w:r>
@@ -1693,17 +1728,17 @@
           <w:tcPr>
             <w:tcW w:type="dxa" w:w="2340"/>
             <w:tcMar>
-              <w:top w:w="50" w:type="dxa"/>
-              <w:bottom w:w="50" w:type="dxa"/>
-              <w:left w:w="80" w:type="dxa"/>
-              <w:right w:w="80" w:type="dxa"/>
+              <w:top w:w="60" w:type="dxa"/>
+              <w:bottom w:w="60" w:type="dxa"/>
+              <w:left w:w="100" w:type="dxa"/>
+              <w:right w:w="100" w:type="dxa"/>
             </w:tcMar>
           </w:tcPr>
           <w:p>
             <w:r>
               <w:rPr>
                 <w:rFonts w:ascii="Times New Roman" w:hAnsi="Times New Roman"/>
-                <w:sz w:val="19"/>
+                <w:sz w:val="23"/>
               </w:rPr>
               <w:t>Customer_ID / Transaction_ID</w:t>
             </w:r>
@@ -1713,17 +1748,17 @@
           <w:tcPr>
             <w:tcW w:type="dxa" w:w="2340"/>
             <w:tcMar>
-              <w:top w:w="50" w:type="dxa"/>
-              <w:bottom w:w="50" w:type="dxa"/>
-              <w:left w:w="80" w:type="dxa"/>
-              <w:right w:w="80" w:type="dxa"/>
+              <w:top w:w="60" w:type="dxa"/>
+              <w:bottom w:w="60" w:type="dxa"/>
+              <w:left w:w="100" w:type="dxa"/>
+              <w:right w:w="100" w:type="dxa"/>
             </w:tcMar>
           </w:tcPr>
           <w:p>
             <w:r>
               <w:rPr>
                 <w:rFonts w:ascii="Times New Roman" w:hAnsi="Times New Roman"/>
-                <w:sz w:val="19"/>
+                <w:sz w:val="23"/>
               </w:rPr>
               <w:t>String (UUID)</w:t>
             </w:r>
@@ -1733,17 +1768,17 @@
           <w:tcPr>
             <w:tcW w:type="dxa" w:w="2340"/>
             <w:tcMar>
-              <w:top w:w="50" w:type="dxa"/>
-              <w:bottom w:w="50" w:type="dxa"/>
-              <w:left w:w="80" w:type="dxa"/>
-              <w:right w:w="80" w:type="dxa"/>
+              <w:top w:w="60" w:type="dxa"/>
+              <w:bottom w:w="60" w:type="dxa"/>
+              <w:left w:w="100" w:type="dxa"/>
+              <w:right w:w="100" w:type="dxa"/>
             </w:tcMar>
           </w:tcPr>
           <w:p>
             <w:r>
               <w:rPr>
                 <w:rFonts w:ascii="Times New Roman" w:hAnsi="Times New Roman"/>
-                <w:sz w:val="19"/>
+                <w:sz w:val="23"/>
               </w:rPr>
               <w:t>Identifier</w:t>
             </w:r>
@@ -1753,17 +1788,17 @@
           <w:tcPr>
             <w:tcW w:type="dxa" w:w="2340"/>
             <w:tcMar>
-              <w:top w:w="50" w:type="dxa"/>
-              <w:bottom w:w="50" w:type="dxa"/>
-              <w:left w:w="80" w:type="dxa"/>
-              <w:right w:w="80" w:type="dxa"/>
+              <w:top w:w="60" w:type="dxa"/>
+              <w:bottom w:w="60" w:type="dxa"/>
+              <w:left w:w="100" w:type="dxa"/>
+              <w:right w:w="100" w:type="dxa"/>
             </w:tcMar>
           </w:tcPr>
           <w:p>
             <w:r>
               <w:rPr>
                 <w:rFonts w:ascii="Times New Roman" w:hAnsi="Times New Roman"/>
-                <w:sz w:val="19"/>
+                <w:sz w:val="23"/>
               </w:rPr>
               <w:t>Hexadecimal unique transaction identifiers; dropped to prevent overfitting.</w:t>
             </w:r>
@@ -1775,17 +1810,17 @@
           <w:tcPr>
             <w:tcW w:type="dxa" w:w="2340"/>
             <w:tcMar>
-              <w:top w:w="50" w:type="dxa"/>
-              <w:bottom w:w="50" w:type="dxa"/>
-              <w:left w:w="80" w:type="dxa"/>
-              <w:right w:w="80" w:type="dxa"/>
+              <w:top w:w="60" w:type="dxa"/>
+              <w:bottom w:w="60" w:type="dxa"/>
+              <w:left w:w="100" w:type="dxa"/>
+              <w:right w:w="100" w:type="dxa"/>
             </w:tcMar>
           </w:tcPr>
           <w:p>
             <w:r>
               <w:rPr>
                 <w:rFonts w:ascii="Times New Roman" w:hAnsi="Times New Roman"/>
-                <w:sz w:val="19"/>
+                <w:sz w:val="23"/>
               </w:rPr>
               <w:t>Age</w:t>
             </w:r>
@@ -1795,17 +1830,17 @@
           <w:tcPr>
             <w:tcW w:type="dxa" w:w="2340"/>
             <w:tcMar>
-              <w:top w:w="50" w:type="dxa"/>
-              <w:bottom w:w="50" w:type="dxa"/>
-              <w:left w:w="80" w:type="dxa"/>
-              <w:right w:w="80" w:type="dxa"/>
+              <w:top w:w="60" w:type="dxa"/>
+              <w:bottom w:w="60" w:type="dxa"/>
+              <w:left w:w="100" w:type="dxa"/>
+              <w:right w:w="100" w:type="dxa"/>
             </w:tcMar>
           </w:tcPr>
           <w:p>
             <w:r>
               <w:rPr>
                 <w:rFonts w:ascii="Times New Roman" w:hAnsi="Times New Roman"/>
-                <w:sz w:val="19"/>
+                <w:sz w:val="23"/>
               </w:rPr>
               <w:t>Integer / Double</w:t>
             </w:r>
@@ -1815,17 +1850,17 @@
           <w:tcPr>
             <w:tcW w:type="dxa" w:w="2340"/>
             <w:tcMar>
-              <w:top w:w="50" w:type="dxa"/>
-              <w:bottom w:w="50" w:type="dxa"/>
-              <w:left w:w="80" w:type="dxa"/>
-              <w:right w:w="80" w:type="dxa"/>
+              <w:top w:w="60" w:type="dxa"/>
+              <w:bottom w:w="60" w:type="dxa"/>
+              <w:left w:w="100" w:type="dxa"/>
+              <w:right w:w="100" w:type="dxa"/>
             </w:tcMar>
           </w:tcPr>
           <w:p>
             <w:r>
               <w:rPr>
                 <w:rFonts w:ascii="Times New Roman" w:hAnsi="Times New Roman"/>
-                <w:sz w:val="19"/>
+                <w:sz w:val="23"/>
               </w:rPr>
               <w:t>Numerical Feature</w:t>
             </w:r>
@@ -1835,17 +1870,17 @@
           <w:tcPr>
             <w:tcW w:type="dxa" w:w="2340"/>
             <w:tcMar>
-              <w:top w:w="50" w:type="dxa"/>
-              <w:bottom w:w="50" w:type="dxa"/>
-              <w:left w:w="80" w:type="dxa"/>
-              <w:right w:w="80" w:type="dxa"/>
+              <w:top w:w="60" w:type="dxa"/>
+              <w:bottom w:w="60" w:type="dxa"/>
+              <w:left w:w="100" w:type="dxa"/>
+              <w:right w:w="100" w:type="dxa"/>
             </w:tcMar>
           </w:tcPr>
           <w:p>
             <w:r>
               <w:rPr>
                 <w:rFonts w:ascii="Times New Roman" w:hAnsi="Times New Roman"/>
-                <w:sz w:val="19"/>
+                <w:sz w:val="23"/>
               </w:rPr>
               <w:t>Customer age in years (Range: 18 – 70).</w:t>
             </w:r>
@@ -1857,17 +1892,17 @@
           <w:tcPr>
             <w:tcW w:type="dxa" w:w="2340"/>
             <w:tcMar>
-              <w:top w:w="50" w:type="dxa"/>
-              <w:bottom w:w="50" w:type="dxa"/>
-              <w:left w:w="80" w:type="dxa"/>
-              <w:right w:w="80" w:type="dxa"/>
+              <w:top w:w="60" w:type="dxa"/>
+              <w:bottom w:w="60" w:type="dxa"/>
+              <w:left w:w="100" w:type="dxa"/>
+              <w:right w:w="100" w:type="dxa"/>
             </w:tcMar>
           </w:tcPr>
           <w:p>
             <w:r>
               <w:rPr>
                 <w:rFonts w:ascii="Times New Roman" w:hAnsi="Times New Roman"/>
-                <w:sz w:val="19"/>
+                <w:sz w:val="23"/>
               </w:rPr>
               <w:t>Gender</w:t>
             </w:r>
@@ -1877,17 +1912,17 @@
           <w:tcPr>
             <w:tcW w:type="dxa" w:w="2340"/>
             <w:tcMar>
-              <w:top w:w="50" w:type="dxa"/>
-              <w:bottom w:w="50" w:type="dxa"/>
-              <w:left w:w="80" w:type="dxa"/>
-              <w:right w:w="80" w:type="dxa"/>
+              <w:top w:w="60" w:type="dxa"/>
+              <w:bottom w:w="60" w:type="dxa"/>
+              <w:left w:w="100" w:type="dxa"/>
+              <w:right w:w="100" w:type="dxa"/>
             </w:tcMar>
           </w:tcPr>
           <w:p>
             <w:r>
               <w:rPr>
                 <w:rFonts w:ascii="Times New Roman" w:hAnsi="Times New Roman"/>
-                <w:sz w:val="19"/>
+                <w:sz w:val="23"/>
               </w:rPr>
               <w:t>String</w:t>
             </w:r>
@@ -1897,17 +1932,17 @@
           <w:tcPr>
             <w:tcW w:type="dxa" w:w="2340"/>
             <w:tcMar>
-              <w:top w:w="50" w:type="dxa"/>
-              <w:bottom w:w="50" w:type="dxa"/>
-              <w:left w:w="80" w:type="dxa"/>
-              <w:right w:w="80" w:type="dxa"/>
+              <w:top w:w="60" w:type="dxa"/>
+              <w:bottom w:w="60" w:type="dxa"/>
+              <w:left w:w="100" w:type="dxa"/>
+              <w:right w:w="100" w:type="dxa"/>
             </w:tcMar>
           </w:tcPr>
           <w:p>
             <w:r>
               <w:rPr>
                 <w:rFonts w:ascii="Times New Roman" w:hAnsi="Times New Roman"/>
-                <w:sz w:val="19"/>
+                <w:sz w:val="23"/>
               </w:rPr>
               <w:t>Categorical Feature</w:t>
             </w:r>
@@ -1917,17 +1952,17 @@
           <w:tcPr>
             <w:tcW w:type="dxa" w:w="2340"/>
             <w:tcMar>
-              <w:top w:w="50" w:type="dxa"/>
-              <w:bottom w:w="50" w:type="dxa"/>
-              <w:left w:w="80" w:type="dxa"/>
-              <w:right w:w="80" w:type="dxa"/>
+              <w:top w:w="60" w:type="dxa"/>
+              <w:bottom w:w="60" w:type="dxa"/>
+              <w:left w:w="100" w:type="dxa"/>
+              <w:right w:w="100" w:type="dxa"/>
             </w:tcMar>
           </w:tcPr>
           <w:p>
             <w:r>
               <w:rPr>
                 <w:rFonts w:ascii="Times New Roman" w:hAnsi="Times New Roman"/>
-                <w:sz w:val="19"/>
+                <w:sz w:val="23"/>
               </w:rPr>
               <w:t>Customer gender (Male, Female). Encoded via StringIndexer and OneHotEncoder.</w:t>
             </w:r>
@@ -1939,17 +1974,17 @@
           <w:tcPr>
             <w:tcW w:type="dxa" w:w="2340"/>
             <w:tcMar>
-              <w:top w:w="50" w:type="dxa"/>
-              <w:bottom w:w="50" w:type="dxa"/>
-              <w:left w:w="80" w:type="dxa"/>
-              <w:right w:w="80" w:type="dxa"/>
+              <w:top w:w="60" w:type="dxa"/>
+              <w:bottom w:w="60" w:type="dxa"/>
+              <w:left w:w="100" w:type="dxa"/>
+              <w:right w:w="100" w:type="dxa"/>
             </w:tcMar>
           </w:tcPr>
           <w:p>
             <w:r>
               <w:rPr>
                 <w:rFonts w:ascii="Times New Roman" w:hAnsi="Times New Roman"/>
-                <w:sz w:val="19"/>
+                <w:sz w:val="23"/>
               </w:rPr>
               <w:t>Account_Type</w:t>
             </w:r>
@@ -1959,17 +1994,17 @@
           <w:tcPr>
             <w:tcW w:type="dxa" w:w="2340"/>
             <w:tcMar>
-              <w:top w:w="50" w:type="dxa"/>
-              <w:bottom w:w="50" w:type="dxa"/>
-              <w:left w:w="80" w:type="dxa"/>
-              <w:right w:w="80" w:type="dxa"/>
+              <w:top w:w="60" w:type="dxa"/>
+              <w:bottom w:w="60" w:type="dxa"/>
+              <w:left w:w="100" w:type="dxa"/>
+              <w:right w:w="100" w:type="dxa"/>
             </w:tcMar>
           </w:tcPr>
           <w:p>
             <w:r>
               <w:rPr>
                 <w:rFonts w:ascii="Times New Roman" w:hAnsi="Times New Roman"/>
-                <w:sz w:val="19"/>
+                <w:sz w:val="23"/>
               </w:rPr>
               <w:t>String</w:t>
             </w:r>
@@ -1979,17 +2014,17 @@
           <w:tcPr>
             <w:tcW w:type="dxa" w:w="2340"/>
             <w:tcMar>
-              <w:top w:w="50" w:type="dxa"/>
-              <w:bottom w:w="50" w:type="dxa"/>
-              <w:left w:w="80" w:type="dxa"/>
-              <w:right w:w="80" w:type="dxa"/>
+              <w:top w:w="60" w:type="dxa"/>
+              <w:bottom w:w="60" w:type="dxa"/>
+              <w:left w:w="100" w:type="dxa"/>
+              <w:right w:w="100" w:type="dxa"/>
             </w:tcMar>
           </w:tcPr>
           <w:p>
             <w:r>
               <w:rPr>
                 <w:rFonts w:ascii="Times New Roman" w:hAnsi="Times New Roman"/>
-                <w:sz w:val="19"/>
+                <w:sz w:val="23"/>
               </w:rPr>
               <w:t>Categorical Feature</w:t>
             </w:r>
@@ -1999,17 +2034,17 @@
           <w:tcPr>
             <w:tcW w:type="dxa" w:w="2340"/>
             <w:tcMar>
-              <w:top w:w="50" w:type="dxa"/>
-              <w:bottom w:w="50" w:type="dxa"/>
-              <w:left w:w="80" w:type="dxa"/>
-              <w:right w:w="80" w:type="dxa"/>
+              <w:top w:w="60" w:type="dxa"/>
+              <w:bottom w:w="60" w:type="dxa"/>
+              <w:left w:w="100" w:type="dxa"/>
+              <w:right w:w="100" w:type="dxa"/>
             </w:tcMar>
           </w:tcPr>
           <w:p>
             <w:r>
               <w:rPr>
                 <w:rFonts w:ascii="Times New Roman" w:hAnsi="Times New Roman"/>
-                <w:sz w:val="19"/>
+                <w:sz w:val="23"/>
               </w:rPr>
               <w:t>Account category: Savings, Business, Checking.</w:t>
             </w:r>
@@ -2021,17 +2056,17 @@
           <w:tcPr>
             <w:tcW w:type="dxa" w:w="2340"/>
             <w:tcMar>
-              <w:top w:w="50" w:type="dxa"/>
-              <w:bottom w:w="50" w:type="dxa"/>
-              <w:left w:w="80" w:type="dxa"/>
-              <w:right w:w="80" w:type="dxa"/>
+              <w:top w:w="60" w:type="dxa"/>
+              <w:bottom w:w="60" w:type="dxa"/>
+              <w:left w:w="100" w:type="dxa"/>
+              <w:right w:w="100" w:type="dxa"/>
             </w:tcMar>
           </w:tcPr>
           <w:p>
             <w:r>
               <w:rPr>
                 <w:rFonts w:ascii="Times New Roman" w:hAnsi="Times New Roman"/>
-                <w:sz w:val="19"/>
+                <w:sz w:val="23"/>
               </w:rPr>
               <w:t>Account_Balance</w:t>
             </w:r>
@@ -2041,17 +2076,17 @@
           <w:tcPr>
             <w:tcW w:type="dxa" w:w="2340"/>
             <w:tcMar>
-              <w:top w:w="50" w:type="dxa"/>
-              <w:bottom w:w="50" w:type="dxa"/>
-              <w:left w:w="80" w:type="dxa"/>
-              <w:right w:w="80" w:type="dxa"/>
+              <w:top w:w="60" w:type="dxa"/>
+              <w:bottom w:w="60" w:type="dxa"/>
+              <w:left w:w="100" w:type="dxa"/>
+              <w:right w:w="100" w:type="dxa"/>
             </w:tcMar>
           </w:tcPr>
           <w:p>
             <w:r>
               <w:rPr>
                 <w:rFonts w:ascii="Times New Roman" w:hAnsi="Times New Roman"/>
-                <w:sz w:val="19"/>
+                <w:sz w:val="23"/>
               </w:rPr>
               <w:t>Double</w:t>
             </w:r>
@@ -2061,17 +2096,17 @@
           <w:tcPr>
             <w:tcW w:type="dxa" w:w="2340"/>
             <w:tcMar>
-              <w:top w:w="50" w:type="dxa"/>
-              <w:bottom w:w="50" w:type="dxa"/>
-              <w:left w:w="80" w:type="dxa"/>
-              <w:right w:w="80" w:type="dxa"/>
+              <w:top w:w="60" w:type="dxa"/>
+              <w:bottom w:w="60" w:type="dxa"/>
+              <w:left w:w="100" w:type="dxa"/>
+              <w:right w:w="100" w:type="dxa"/>
             </w:tcMar>
           </w:tcPr>
           <w:p>
             <w:r>
               <w:rPr>
                 <w:rFonts w:ascii="Times New Roman" w:hAnsi="Times New Roman"/>
-                <w:sz w:val="19"/>
+                <w:sz w:val="23"/>
               </w:rPr>
               <w:t>Numerical Feature</w:t>
             </w:r>
@@ -2081,17 +2116,17 @@
           <w:tcPr>
             <w:tcW w:type="dxa" w:w="2340"/>
             <w:tcMar>
-              <w:top w:w="50" w:type="dxa"/>
-              <w:bottom w:w="50" w:type="dxa"/>
-              <w:left w:w="80" w:type="dxa"/>
-              <w:right w:w="80" w:type="dxa"/>
+              <w:top w:w="60" w:type="dxa"/>
+              <w:bottom w:w="60" w:type="dxa"/>
+              <w:left w:w="100" w:type="dxa"/>
+              <w:right w:w="100" w:type="dxa"/>
             </w:tcMar>
           </w:tcPr>
           <w:p>
             <w:r>
               <w:rPr>
                 <w:rFonts w:ascii="Times New Roman" w:hAnsi="Times New Roman"/>
-                <w:sz w:val="19"/>
+                <w:sz w:val="23"/>
               </w:rPr>
               <w:t>Account balance in INR at the time of transaction.</w:t>
             </w:r>
@@ -2103,17 +2138,17 @@
           <w:tcPr>
             <w:tcW w:type="dxa" w:w="2340"/>
             <w:tcMar>
-              <w:top w:w="50" w:type="dxa"/>
-              <w:bottom w:w="50" w:type="dxa"/>
-              <w:left w:w="80" w:type="dxa"/>
-              <w:right w:w="80" w:type="dxa"/>
+              <w:top w:w="60" w:type="dxa"/>
+              <w:bottom w:w="60" w:type="dxa"/>
+              <w:left w:w="100" w:type="dxa"/>
+              <w:right w:w="100" w:type="dxa"/>
             </w:tcMar>
           </w:tcPr>
           <w:p>
             <w:r>
               <w:rPr>
                 <w:rFonts w:ascii="Times New Roman" w:hAnsi="Times New Roman"/>
-                <w:sz w:val="19"/>
+                <w:sz w:val="23"/>
               </w:rPr>
               <w:t>Transaction_Time</w:t>
             </w:r>
@@ -2123,17 +2158,17 @@
           <w:tcPr>
             <w:tcW w:type="dxa" w:w="2340"/>
             <w:tcMar>
-              <w:top w:w="50" w:type="dxa"/>
-              <w:bottom w:w="50" w:type="dxa"/>
-              <w:left w:w="80" w:type="dxa"/>
-              <w:right w:w="80" w:type="dxa"/>
+              <w:top w:w="60" w:type="dxa"/>
+              <w:bottom w:w="60" w:type="dxa"/>
+              <w:left w:w="100" w:type="dxa"/>
+              <w:right w:w="100" w:type="dxa"/>
             </w:tcMar>
           </w:tcPr>
           <w:p>
             <w:r>
               <w:rPr>
                 <w:rFonts w:ascii="Times New Roman" w:hAnsi="Times New Roman"/>
-                <w:sz w:val="19"/>
+                <w:sz w:val="23"/>
               </w:rPr>
               <w:t>Timestamp</w:t>
             </w:r>
@@ -2143,17 +2178,17 @@
           <w:tcPr>
             <w:tcW w:type="dxa" w:w="2340"/>
             <w:tcMar>
-              <w:top w:w="50" w:type="dxa"/>
-              <w:bottom w:w="50" w:type="dxa"/>
-              <w:left w:w="80" w:type="dxa"/>
-              <w:right w:w="80" w:type="dxa"/>
+              <w:top w:w="60" w:type="dxa"/>
+              <w:bottom w:w="60" w:type="dxa"/>
+              <w:left w:w="100" w:type="dxa"/>
+              <w:right w:w="100" w:type="dxa"/>
             </w:tcMar>
           </w:tcPr>
           <w:p>
             <w:r>
               <w:rPr>
                 <w:rFonts w:ascii="Times New Roman" w:hAnsi="Times New Roman"/>
-                <w:sz w:val="19"/>
+                <w:sz w:val="23"/>
               </w:rPr>
               <w:t>Temporal Attribute</w:t>
             </w:r>
@@ -2163,17 +2198,17 @@
           <w:tcPr>
             <w:tcW w:type="dxa" w:w="2340"/>
             <w:tcMar>
-              <w:top w:w="50" w:type="dxa"/>
-              <w:bottom w:w="50" w:type="dxa"/>
-              <w:left w:w="80" w:type="dxa"/>
-              <w:right w:w="80" w:type="dxa"/>
+              <w:top w:w="60" w:type="dxa"/>
+              <w:bottom w:w="60" w:type="dxa"/>
+              <w:left w:w="100" w:type="dxa"/>
+              <w:right w:w="100" w:type="dxa"/>
             </w:tcMar>
           </w:tcPr>
           <w:p>
             <w:r>
               <w:rPr>
                 <w:rFonts w:ascii="Times New Roman" w:hAnsi="Times New Roman"/>
-                <w:sz w:val="19"/>
+                <w:sz w:val="23"/>
               </w:rPr>
               <w:t>Transaction timestamp; hour of day extracted (0 – 23) as Transaction_Hour.</w:t>
             </w:r>
@@ -2185,17 +2220,17 @@
           <w:tcPr>
             <w:tcW w:type="dxa" w:w="2340"/>
             <w:tcMar>
-              <w:top w:w="50" w:type="dxa"/>
-              <w:bottom w:w="50" w:type="dxa"/>
-              <w:left w:w="80" w:type="dxa"/>
-              <w:right w:w="80" w:type="dxa"/>
+              <w:top w:w="60" w:type="dxa"/>
+              <w:bottom w:w="60" w:type="dxa"/>
+              <w:left w:w="100" w:type="dxa"/>
+              <w:right w:w="100" w:type="dxa"/>
             </w:tcMar>
           </w:tcPr>
           <w:p>
             <w:r>
               <w:rPr>
                 <w:rFonts w:ascii="Times New Roman" w:hAnsi="Times New Roman"/>
-                <w:sz w:val="19"/>
+                <w:sz w:val="23"/>
               </w:rPr>
               <w:t>Transaction_Amount</w:t>
             </w:r>
@@ -2205,17 +2240,17 @@
           <w:tcPr>
             <w:tcW w:type="dxa" w:w="2340"/>
             <w:tcMar>
-              <w:top w:w="50" w:type="dxa"/>
-              <w:bottom w:w="50" w:type="dxa"/>
-              <w:left w:w="80" w:type="dxa"/>
-              <w:right w:w="80" w:type="dxa"/>
+              <w:top w:w="60" w:type="dxa"/>
+              <w:bottom w:w="60" w:type="dxa"/>
+              <w:left w:w="100" w:type="dxa"/>
+              <w:right w:w="100" w:type="dxa"/>
             </w:tcMar>
           </w:tcPr>
           <w:p>
             <w:r>
               <w:rPr>
                 <w:rFonts w:ascii="Times New Roman" w:hAnsi="Times New Roman"/>
-                <w:sz w:val="19"/>
+                <w:sz w:val="23"/>
               </w:rPr>
               <w:t>Double</w:t>
             </w:r>
@@ -2225,17 +2260,17 @@
           <w:tcPr>
             <w:tcW w:type="dxa" w:w="2340"/>
             <w:tcMar>
-              <w:top w:w="50" w:type="dxa"/>
-              <w:bottom w:w="50" w:type="dxa"/>
-              <w:left w:w="80" w:type="dxa"/>
-              <w:right w:w="80" w:type="dxa"/>
+              <w:top w:w="60" w:type="dxa"/>
+              <w:bottom w:w="60" w:type="dxa"/>
+              <w:left w:w="100" w:type="dxa"/>
+              <w:right w:w="100" w:type="dxa"/>
             </w:tcMar>
           </w:tcPr>
           <w:p>
             <w:r>
               <w:rPr>
                 <w:rFonts w:ascii="Times New Roman" w:hAnsi="Times New Roman"/>
-                <w:sz w:val="19"/>
+                <w:sz w:val="23"/>
               </w:rPr>
               <w:t>Regression Target</w:t>
             </w:r>
@@ -2245,17 +2280,17 @@
           <w:tcPr>
             <w:tcW w:type="dxa" w:w="2340"/>
             <w:tcMar>
-              <w:top w:w="50" w:type="dxa"/>
-              <w:bottom w:w="50" w:type="dxa"/>
-              <w:left w:w="80" w:type="dxa"/>
-              <w:right w:w="80" w:type="dxa"/>
+              <w:top w:w="60" w:type="dxa"/>
+              <w:bottom w:w="60" w:type="dxa"/>
+              <w:left w:w="100" w:type="dxa"/>
+              <w:right w:w="100" w:type="dxa"/>
             </w:tcMar>
           </w:tcPr>
           <w:p>
             <w:r>
               <w:rPr>
                 <w:rFonts w:ascii="Times New Roman" w:hAnsi="Times New Roman"/>
-                <w:sz w:val="19"/>
+                <w:sz w:val="23"/>
               </w:rPr>
               <w:t>Value of the transaction in INR; continuous target for Linear Regression.</w:t>
             </w:r>
@@ -2267,17 +2302,17 @@
           <w:tcPr>
             <w:tcW w:type="dxa" w:w="2340"/>
             <w:tcMar>
-              <w:top w:w="50" w:type="dxa"/>
-              <w:bottom w:w="50" w:type="dxa"/>
-              <w:left w:w="80" w:type="dxa"/>
-              <w:right w:w="80" w:type="dxa"/>
+              <w:top w:w="60" w:type="dxa"/>
+              <w:bottom w:w="60" w:type="dxa"/>
+              <w:left w:w="100" w:type="dxa"/>
+              <w:right w:w="100" w:type="dxa"/>
             </w:tcMar>
           </w:tcPr>
           <w:p>
             <w:r>
               <w:rPr>
                 <w:rFonts w:ascii="Times New Roman" w:hAnsi="Times New Roman"/>
-                <w:sz w:val="19"/>
+                <w:sz w:val="23"/>
               </w:rPr>
               <w:t>Transaction_Type</w:t>
             </w:r>
@@ -2287,17 +2322,17 @@
           <w:tcPr>
             <w:tcW w:type="dxa" w:w="2340"/>
             <w:tcMar>
-              <w:top w:w="50" w:type="dxa"/>
-              <w:bottom w:w="50" w:type="dxa"/>
-              <w:left w:w="80" w:type="dxa"/>
-              <w:right w:w="80" w:type="dxa"/>
+              <w:top w:w="60" w:type="dxa"/>
+              <w:bottom w:w="60" w:type="dxa"/>
+              <w:left w:w="100" w:type="dxa"/>
+              <w:right w:w="100" w:type="dxa"/>
             </w:tcMar>
           </w:tcPr>
           <w:p>
             <w:r>
               <w:rPr>
                 <w:rFonts w:ascii="Times New Roman" w:hAnsi="Times New Roman"/>
-                <w:sz w:val="19"/>
+                <w:sz w:val="23"/>
               </w:rPr>
               <w:t>String</w:t>
             </w:r>
@@ -2307,17 +2342,17 @@
           <w:tcPr>
             <w:tcW w:type="dxa" w:w="2340"/>
             <w:tcMar>
-              <w:top w:w="50" w:type="dxa"/>
-              <w:bottom w:w="50" w:type="dxa"/>
-              <w:left w:w="80" w:type="dxa"/>
-              <w:right w:w="80" w:type="dxa"/>
+              <w:top w:w="60" w:type="dxa"/>
+              <w:bottom w:w="60" w:type="dxa"/>
+              <w:left w:w="100" w:type="dxa"/>
+              <w:right w:w="100" w:type="dxa"/>
             </w:tcMar>
           </w:tcPr>
           <w:p>
             <w:r>
               <w:rPr>
                 <w:rFonts w:ascii="Times New Roman" w:hAnsi="Times New Roman"/>
-                <w:sz w:val="19"/>
+                <w:sz w:val="23"/>
               </w:rPr>
               <w:t>Categorical Feature</w:t>
             </w:r>
@@ -2327,17 +2362,17 @@
           <w:tcPr>
             <w:tcW w:type="dxa" w:w="2340"/>
             <w:tcMar>
-              <w:top w:w="50" w:type="dxa"/>
-              <w:bottom w:w="50" w:type="dxa"/>
-              <w:left w:w="80" w:type="dxa"/>
-              <w:right w:w="80" w:type="dxa"/>
+              <w:top w:w="60" w:type="dxa"/>
+              <w:bottom w:w="60" w:type="dxa"/>
+              <w:left w:w="100" w:type="dxa"/>
+              <w:right w:w="100" w:type="dxa"/>
             </w:tcMar>
           </w:tcPr>
           <w:p>
             <w:r>
               <w:rPr>
                 <w:rFonts w:ascii="Times New Roman" w:hAnsi="Times New Roman"/>
-                <w:sz w:val="19"/>
+                <w:sz w:val="23"/>
               </w:rPr>
               <w:t>Mode: Transfer, Bill Payment, Debit, Credit, Withdrawal.</w:t>
             </w:r>
@@ -2349,17 +2384,17 @@
           <w:tcPr>
             <w:tcW w:type="dxa" w:w="2340"/>
             <w:tcMar>
-              <w:top w:w="50" w:type="dxa"/>
-              <w:bottom w:w="50" w:type="dxa"/>
-              <w:left w:w="80" w:type="dxa"/>
-              <w:right w:w="80" w:type="dxa"/>
+              <w:top w:w="60" w:type="dxa"/>
+              <w:bottom w:w="60" w:type="dxa"/>
+              <w:left w:w="100" w:type="dxa"/>
+              <w:right w:w="100" w:type="dxa"/>
             </w:tcMar>
           </w:tcPr>
           <w:p>
             <w:r>
               <w:rPr>
                 <w:rFonts w:ascii="Times New Roman" w:hAnsi="Times New Roman"/>
-                <w:sz w:val="19"/>
+                <w:sz w:val="23"/>
               </w:rPr>
               <w:t>Merchant_Category</w:t>
             </w:r>
@@ -2369,17 +2404,17 @@
           <w:tcPr>
             <w:tcW w:type="dxa" w:w="2340"/>
             <w:tcMar>
-              <w:top w:w="50" w:type="dxa"/>
-              <w:bottom w:w="50" w:type="dxa"/>
-              <w:left w:w="80" w:type="dxa"/>
-              <w:right w:w="80" w:type="dxa"/>
+              <w:top w:w="60" w:type="dxa"/>
+              <w:bottom w:w="60" w:type="dxa"/>
+              <w:left w:w="100" w:type="dxa"/>
+              <w:right w:w="100" w:type="dxa"/>
             </w:tcMar>
           </w:tcPr>
           <w:p>
             <w:r>
               <w:rPr>
                 <w:rFonts w:ascii="Times New Roman" w:hAnsi="Times New Roman"/>
-                <w:sz w:val="19"/>
+                <w:sz w:val="23"/>
               </w:rPr>
               <w:t>String</w:t>
             </w:r>
@@ -2389,17 +2424,17 @@
           <w:tcPr>
             <w:tcW w:type="dxa" w:w="2340"/>
             <w:tcMar>
-              <w:top w:w="50" w:type="dxa"/>
-              <w:bottom w:w="50" w:type="dxa"/>
-              <w:left w:w="80" w:type="dxa"/>
-              <w:right w:w="80" w:type="dxa"/>
+              <w:top w:w="60" w:type="dxa"/>
+              <w:bottom w:w="60" w:type="dxa"/>
+              <w:left w:w="100" w:type="dxa"/>
+              <w:right w:w="100" w:type="dxa"/>
             </w:tcMar>
           </w:tcPr>
           <w:p>
             <w:r>
               <w:rPr>
                 <w:rFonts w:ascii="Times New Roman" w:hAnsi="Times New Roman"/>
-                <w:sz w:val="19"/>
+                <w:sz w:val="23"/>
               </w:rPr>
               <w:t>Categorical Feature</w:t>
             </w:r>
@@ -2409,17 +2444,17 @@
           <w:tcPr>
             <w:tcW w:type="dxa" w:w="2340"/>
             <w:tcMar>
-              <w:top w:w="50" w:type="dxa"/>
-              <w:bottom w:w="50" w:type="dxa"/>
-              <w:left w:w="80" w:type="dxa"/>
-              <w:right w:w="80" w:type="dxa"/>
+              <w:top w:w="60" w:type="dxa"/>
+              <w:bottom w:w="60" w:type="dxa"/>
+              <w:left w:w="100" w:type="dxa"/>
+              <w:right w:w="100" w:type="dxa"/>
             </w:tcMar>
           </w:tcPr>
           <w:p>
             <w:r>
               <w:rPr>
                 <w:rFonts w:ascii="Times New Roman" w:hAnsi="Times New Roman"/>
-                <w:sz w:val="19"/>
+                <w:sz w:val="23"/>
               </w:rPr>
               <w:t>Merchant domain: Restaurant, Groceries, Entertainment, Health, Clothing.</w:t>
             </w:r>
@@ -2431,17 +2466,17 @@
           <w:tcPr>
             <w:tcW w:type="dxa" w:w="2340"/>
             <w:tcMar>
-              <w:top w:w="50" w:type="dxa"/>
-              <w:bottom w:w="50" w:type="dxa"/>
-              <w:left w:w="80" w:type="dxa"/>
-              <w:right w:w="80" w:type="dxa"/>
+              <w:top w:w="60" w:type="dxa"/>
+              <w:bottom w:w="60" w:type="dxa"/>
+              <w:left w:w="100" w:type="dxa"/>
+              <w:right w:w="100" w:type="dxa"/>
             </w:tcMar>
           </w:tcPr>
           <w:p>
             <w:r>
               <w:rPr>
                 <w:rFonts w:ascii="Times New Roman" w:hAnsi="Times New Roman"/>
-                <w:sz w:val="19"/>
+                <w:sz w:val="23"/>
               </w:rPr>
               <w:t>Is_Fraud</w:t>
             </w:r>
@@ -2451,17 +2486,17 @@
           <w:tcPr>
             <w:tcW w:type="dxa" w:w="2340"/>
             <w:tcMar>
-              <w:top w:w="50" w:type="dxa"/>
-              <w:bottom w:w="50" w:type="dxa"/>
-              <w:left w:w="80" w:type="dxa"/>
-              <w:right w:w="80" w:type="dxa"/>
+              <w:top w:w="60" w:type="dxa"/>
+              <w:bottom w:w="60" w:type="dxa"/>
+              <w:left w:w="100" w:type="dxa"/>
+              <w:right w:w="100" w:type="dxa"/>
             </w:tcMar>
           </w:tcPr>
           <w:p>
             <w:r>
               <w:rPr>
                 <w:rFonts w:ascii="Times New Roman" w:hAnsi="Times New Roman"/>
-                <w:sz w:val="19"/>
+                <w:sz w:val="23"/>
               </w:rPr>
               <w:t>Double / Integer</w:t>
             </w:r>
@@ -2471,17 +2506,17 @@
           <w:tcPr>
             <w:tcW w:type="dxa" w:w="2340"/>
             <w:tcMar>
-              <w:top w:w="50" w:type="dxa"/>
-              <w:bottom w:w="50" w:type="dxa"/>
-              <w:left w:w="80" w:type="dxa"/>
-              <w:right w:w="80" w:type="dxa"/>
+              <w:top w:w="60" w:type="dxa"/>
+              <w:bottom w:w="60" w:type="dxa"/>
+              <w:left w:w="100" w:type="dxa"/>
+              <w:right w:w="100" w:type="dxa"/>
             </w:tcMar>
           </w:tcPr>
           <w:p>
             <w:r>
               <w:rPr>
                 <w:rFonts w:ascii="Times New Roman" w:hAnsi="Times New Roman"/>
-                <w:sz w:val="19"/>
+                <w:sz w:val="23"/>
               </w:rPr>
               <w:t>Classification Target</w:t>
             </w:r>
@@ -2491,17 +2526,17 @@
           <w:tcPr>
             <w:tcW w:type="dxa" w:w="2340"/>
             <w:tcMar>
-              <w:top w:w="50" w:type="dxa"/>
-              <w:bottom w:w="50" w:type="dxa"/>
-              <w:left w:w="80" w:type="dxa"/>
-              <w:right w:w="80" w:type="dxa"/>
+              <w:top w:w="60" w:type="dxa"/>
+              <w:bottom w:w="60" w:type="dxa"/>
+              <w:left w:w="100" w:type="dxa"/>
+              <w:right w:w="100" w:type="dxa"/>
             </w:tcMar>
           </w:tcPr>
           <w:p>
             <w:r>
               <w:rPr>
                 <w:rFonts w:ascii="Times New Roman" w:hAnsi="Times New Roman"/>
-                <w:sz w:val="19"/>
+                <w:sz w:val="23"/>
               </w:rPr>
               <w:t>Ground truth label: 0 = Legitimate (94.96%), 1 = Fraudulent (5.04%).</w:t>
             </w:r>
@@ -2523,14 +2558,14 @@
         <w:rPr>
           <w:rFonts w:ascii="Times New Roman" w:hAnsi="Times New Roman"/>
           <w:b/>
-          <w:sz w:val="28"/>
+          <w:sz w:val="30"/>
         </w:rPr>
         <w:t>5. Dataset Source</w:t>
       </w:r>
     </w:p>
     <w:p>
       <w:r>
-        <w:t>• Platform: Kaggle Datasets</w:t>
+        <w:t>• Platform: Kaggle Datasets Repository</w:t>
         <w:br/>
         <w:t>• Dataset Title: Bank Transaction Fraud Detection</w:t>
         <w:br/>
@@ -2542,7 +2577,7 @@
         <w:br/>
         <w:t>• Local Filename: Bank_Transaction_Fraud_Detection.csv</w:t>
         <w:br/>
-        <w:t>• Dataset Size: 68,295,288 bytes (~68.3 MB)</w:t>
+        <w:t>• Dataset File Size: 68,295,288 bytes (~68.3 MB)</w:t>
         <w:br/>
         <w:t>• Total Records: 200,000 verified rows across 24 columns.</w:t>
       </w:r>
@@ -2556,7 +2591,7 @@
         <w:rPr>
           <w:rFonts w:ascii="Times New Roman" w:hAnsi="Times New Roman"/>
           <w:b/>
-          <w:sz w:val="28"/>
+          <w:sz w:val="30"/>
         </w:rPr>
         <w:t>6. Tools &amp; Technologies Used</w:t>
       </w:r>
@@ -2569,7 +2604,7 @@
       <w:r>
         <w:rPr>
           <w:rFonts w:ascii="Times New Roman" w:hAnsi="Times New Roman"/>
-          <w:sz w:val="23"/>
+          <w:sz w:val="24"/>
         </w:rPr>
         <w:t>Apache Spark 3.5.9: High-performance distributed cluster computing framework utilizing multi-core parallelism (local[*]) with in-memory RDD caching and Catalyst query optimizer.</w:t>
       </w:r>
@@ -2582,7 +2617,7 @@
       <w:r>
         <w:rPr>
           <w:rFonts w:ascii="Times New Roman" w:hAnsi="Times New Roman"/>
-          <w:sz w:val="23"/>
+          <w:sz w:val="24"/>
         </w:rPr>
         <w:t>PySpark (Python 3.10): Python interface to Apache Spark. Spark SQL DataFrames were utilized for distributed data manipulation, and Spark MLlib was used for machine learning pipelines.</w:t>
       </w:r>
@@ -2595,7 +2630,7 @@
       <w:r>
         <w:rPr>
           <w:rFonts w:ascii="Times New Roman" w:hAnsi="Times New Roman"/>
-          <w:sz w:val="23"/>
+          <w:sz w:val="24"/>
         </w:rPr>
         <w:t>Java Development Kit 8 (JDK 1.8.0_501): Java Virtual Machine backend required by Spark, configured locally without modifying global Java configurations.</w:t>
       </w:r>
@@ -2608,7 +2643,7 @@
       <w:r>
         <w:rPr>
           <w:rFonts w:ascii="Times New Roman" w:hAnsi="Times New Roman"/>
-          <w:sz w:val="23"/>
+          <w:sz w:val="24"/>
         </w:rPr>
         <w:t>Jupyter Notebook: Interactive notebook interface for developing, executing, and documenting the cluster computing workflow.</w:t>
       </w:r>
@@ -2621,7 +2656,7 @@
       <w:r>
         <w:rPr>
           <w:rFonts w:ascii="Times New Roman" w:hAnsi="Times New Roman"/>
-          <w:sz w:val="23"/>
+          <w:sz w:val="24"/>
         </w:rPr>
         <w:t>Pandas &amp; NumPy: Python data manipulation libraries utilized for converting summary aggregates and confusion matrices into tabular representations.</w:t>
       </w:r>
@@ -2634,7 +2669,7 @@
       <w:r>
         <w:rPr>
           <w:rFonts w:ascii="Times New Roman" w:hAnsi="Times New Roman"/>
-          <w:sz w:val="23"/>
+          <w:sz w:val="24"/>
         </w:rPr>
         <w:t>Matplotlib &amp; Seaborn: Visual analytics libraries utilized for generating the correlation heatmap, linear regression scatter plots, and confusion matrix visual displays.</w:t>
       </w:r>
@@ -2648,7 +2683,7 @@
         <w:rPr>
           <w:rFonts w:ascii="Times New Roman" w:hAnsi="Times New Roman"/>
           <w:b/>
-          <w:sz w:val="28"/>
+          <w:sz w:val="30"/>
         </w:rPr>
         <w:t>7. Implementation / Methodology</w:t>
       </w:r>
@@ -2656,13 +2691,13 @@
     <w:p>
       <w:pPr>
         <w:keepNext/>
-        <w:spacing w:before="240" w:after="80"/>
+        <w:spacing w:before="280" w:after="80"/>
       </w:pPr>
       <w:r>
         <w:rPr>
           <w:rFonts w:ascii="Times New Roman" w:hAnsi="Times New Roman"/>
           <w:b/>
-          <w:sz w:val="24"/>
+          <w:sz w:val="26"/>
         </w:rPr>
         <w:t>7.1 Spark Session Initialization &amp; Environment Isolation</w:t>
       </w:r>
@@ -2675,13 +2710,13 @@
     <w:p>
       <w:pPr>
         <w:keepNext/>
-        <w:spacing w:before="240" w:after="80"/>
+        <w:spacing w:before="280" w:after="80"/>
       </w:pPr>
       <w:r>
         <w:rPr>
           <w:rFonts w:ascii="Times New Roman" w:hAnsi="Times New Roman"/>
           <w:b/>
-          <w:sz w:val="24"/>
+          <w:sz w:val="26"/>
         </w:rPr>
         <w:t>7.2 Distributed Data Ingestion &amp; Quality Auditing</w:t>
       </w:r>
@@ -2698,13 +2733,13 @@
     <w:p>
       <w:pPr>
         <w:keepNext/>
-        <w:spacing w:before="240" w:after="80"/>
+        <w:spacing w:before="280" w:after="80"/>
       </w:pPr>
       <w:r>
         <w:rPr>
           <w:rFonts w:ascii="Times New Roman" w:hAnsi="Times New Roman"/>
           <w:b/>
-          <w:sz w:val="24"/>
+          <w:sz w:val="26"/>
         </w:rPr>
         <w:t>7.3 Exploratory Data Analysis &amp; Relationship Exploration</w:t>
       </w:r>
@@ -2717,13 +2752,13 @@
     <w:p>
       <w:pPr>
         <w:keepNext/>
-        <w:spacing w:before="240" w:after="80"/>
+        <w:spacing w:before="280" w:after="80"/>
       </w:pPr>
       <w:r>
         <w:rPr>
           <w:rFonts w:ascii="Times New Roman" w:hAnsi="Times New Roman"/>
           <w:b/>
-          <w:sz w:val="24"/>
+          <w:sz w:val="26"/>
         </w:rPr>
         <w:t>7.4 Feature Engineering &amp; Correlation Heatmap</w:t>
       </w:r>
@@ -2736,13 +2771,13 @@
     <w:p>
       <w:pPr>
         <w:keepNext/>
-        <w:spacing w:before="240" w:after="80"/>
+        <w:spacing w:before="280" w:after="80"/>
       </w:pPr>
       <w:r>
         <w:rPr>
           <w:rFonts w:ascii="Times New Roman" w:hAnsi="Times New Roman"/>
           <w:b/>
-          <w:sz w:val="24"/>
+          <w:sz w:val="26"/>
         </w:rPr>
         <w:t>7.5 Unsupervised Learning: K-Means Clustering</w:t>
       </w:r>
@@ -2755,13 +2790,13 @@
     <w:p>
       <w:pPr>
         <w:keepNext/>
-        <w:spacing w:before="240" w:after="80"/>
+        <w:spacing w:before="280" w:after="80"/>
       </w:pPr>
       <w:r>
         <w:rPr>
           <w:rFonts w:ascii="Times New Roman" w:hAnsi="Times New Roman"/>
           <w:b/>
-          <w:sz w:val="24"/>
+          <w:sz w:val="26"/>
         </w:rPr>
         <w:t>7.6 Categorical Encoding &amp; Dataset Partitioning</w:t>
       </w:r>
@@ -2774,13 +2809,13 @@
     <w:p>
       <w:pPr>
         <w:keepNext/>
-        <w:spacing w:before="240" w:after="80"/>
+        <w:spacing w:before="280" w:after="80"/>
       </w:pPr>
       <w:r>
         <w:rPr>
           <w:rFonts w:ascii="Times New Roman" w:hAnsi="Times New Roman"/>
           <w:b/>
-          <w:sz w:val="24"/>
+          <w:sz w:val="26"/>
         </w:rPr>
         <w:t>7.7 Supervised Regression: Linear Regression</w:t>
       </w:r>
@@ -2793,13 +2828,13 @@
     <w:p>
       <w:pPr>
         <w:keepNext/>
-        <w:spacing w:before="240" w:after="80"/>
+        <w:spacing w:before="280" w:after="80"/>
       </w:pPr>
       <w:r>
         <w:rPr>
           <w:rFonts w:ascii="Times New Roman" w:hAnsi="Times New Roman"/>
           <w:b/>
-          <w:sz w:val="24"/>
+          <w:sz w:val="26"/>
         </w:rPr>
         <w:t>7.8 Supervised Classification: Fraud Detection Benchmarking</w:t>
       </w:r>
@@ -2828,26 +2863,192 @@
         <w:rPr>
           <w:rFonts w:ascii="Times New Roman" w:hAnsi="Times New Roman"/>
           <w:b/>
-          <w:sz w:val="28"/>
+          <w:sz w:val="30"/>
         </w:rPr>
         <w:t>8. Complete Source Code</w:t>
       </w:r>
     </w:p>
     <w:p>
+      <w:pPr>
+        <w:spacing w:after="120"/>
+      </w:pPr>
       <w:r>
-        <w:t>The complete source code from the executed Jupyter Notebook INT315_Project_CA2.ipynb is structured below by functional steps.</w:t>
+        <w:t>The complete source code, dataset artifacts, and reproducible runtime launcher scripts for this project are publicly maintained and accessible at the official GitHub repository provided below:</w:t>
+      </w:r>
+    </w:p>
+    <w:tbl>
+      <w:tblPr>
+        <w:tblW w:type="auto" w:w="0"/>
+        <w:jc w:val="center"/>
+        <w:tblLook w:firstColumn="1" w:firstRow="1" w:lastColumn="0" w:lastRow="0" w:noHBand="0" w:noVBand="1" w:val="04A0"/>
+        <w:tblBorders>
+          <w:top w:val="single" w:sz="6" w:space="0" w:color="000000"/>
+          <w:left w:val="single" w:sz="6" w:space="0" w:color="000000"/>
+          <w:bottom w:val="single" w:sz="6" w:space="0" w:color="000000"/>
+          <w:right w:val="single" w:sz="6" w:space="0" w:color="000000"/>
+          <w:insideH w:val="single" w:sz="4" w:space="0" w:color="000000"/>
+          <w:insideV w:val="single" w:sz="4" w:space="0" w:color="000000"/>
+        </w:tblBorders>
+      </w:tblPr>
+      <w:tblGrid>
+        <w:gridCol w:w="4680"/>
+        <w:gridCol w:w="4680"/>
+      </w:tblGrid>
+      <w:tr>
+        <w:tc>
+          <w:tcPr>
+            <w:tcW w:type="dxa" w:w="3168"/>
+            <w:tcMar>
+              <w:top w:w="70" w:type="dxa"/>
+              <w:bottom w:w="70" w:type="dxa"/>
+              <w:left w:w="100" w:type="dxa"/>
+              <w:right w:w="100" w:type="dxa"/>
+            </w:tcMar>
+          </w:tcPr>
+          <w:p>
+            <w:r>
+              <w:rPr>
+                <w:rFonts w:ascii="Times New Roman" w:hAnsi="Times New Roman"/>
+                <w:b/>
+                <w:sz w:val="23"/>
+              </w:rPr>
+              <w:t>GitHub Project Repository</w:t>
+            </w:r>
+          </w:p>
+        </w:tc>
+        <w:tc>
+          <w:tcPr>
+            <w:tcW w:type="dxa" w:w="6192"/>
+            <w:tcMar>
+              <w:top w:w="70" w:type="dxa"/>
+              <w:bottom w:w="70" w:type="dxa"/>
+              <w:left w:w="100" w:type="dxa"/>
+              <w:right w:w="100" w:type="dxa"/>
+            </w:tcMar>
+          </w:tcPr>
+          <w:p>
+            <w:r>
+              <w:rPr>
+                <w:rFonts w:ascii="Times New Roman" w:hAnsi="Times New Roman"/>
+                <w:b/>
+                <w:sz w:val="23"/>
+              </w:rPr>
+              <w:t>https://github.com/shayan-codes-405/bank-fraud-detection-pyspark.git</w:t>
+            </w:r>
+          </w:p>
+        </w:tc>
+      </w:tr>
+      <w:tr>
+        <w:tc>
+          <w:tcPr>
+            <w:tcW w:type="dxa" w:w="3168"/>
+            <w:tcMar>
+              <w:top w:w="70" w:type="dxa"/>
+              <w:bottom w:w="70" w:type="dxa"/>
+              <w:left w:w="100" w:type="dxa"/>
+              <w:right w:w="100" w:type="dxa"/>
+            </w:tcMar>
+          </w:tcPr>
+          <w:p>
+            <w:r>
+              <w:rPr>
+                <w:rFonts w:ascii="Times New Roman" w:hAnsi="Times New Roman"/>
+                <w:b/>
+                <w:sz w:val="23"/>
+              </w:rPr>
+              <w:t>Direct Jupyter Notebook (.ipynb)</w:t>
+            </w:r>
+          </w:p>
+        </w:tc>
+        <w:tc>
+          <w:tcPr>
+            <w:tcW w:type="dxa" w:w="6192"/>
+            <w:tcMar>
+              <w:top w:w="70" w:type="dxa"/>
+              <w:bottom w:w="70" w:type="dxa"/>
+              <w:left w:w="100" w:type="dxa"/>
+              <w:right w:w="100" w:type="dxa"/>
+            </w:tcMar>
+          </w:tcPr>
+          <w:p>
+            <w:r>
+              <w:rPr>
+                <w:rFonts w:ascii="Times New Roman" w:hAnsi="Times New Roman"/>
+                <w:b w:val="0"/>
+                <w:sz w:val="23"/>
+              </w:rPr>
+              <w:t>https://github.com/shayan-codes-405/bank-fraud-detection-pyspark/blob/main/INT315_Project_CA2.ipynb</w:t>
+            </w:r>
+          </w:p>
+        </w:tc>
+      </w:tr>
+      <w:tr>
+        <w:tc>
+          <w:tcPr>
+            <w:tcW w:type="dxa" w:w="3168"/>
+            <w:tcMar>
+              <w:top w:w="70" w:type="dxa"/>
+              <w:bottom w:w="70" w:type="dxa"/>
+              <w:left w:w="100" w:type="dxa"/>
+              <w:right w:w="100" w:type="dxa"/>
+            </w:tcMar>
+          </w:tcPr>
+          <w:p>
+            <w:r>
+              <w:rPr>
+                <w:rFonts w:ascii="Times New Roman" w:hAnsi="Times New Roman"/>
+                <w:b/>
+                <w:sz w:val="23"/>
+              </w:rPr>
+              <w:t>Kaggle Dataset Source Link</w:t>
+            </w:r>
+          </w:p>
+        </w:tc>
+        <w:tc>
+          <w:tcPr>
+            <w:tcW w:type="dxa" w:w="6192"/>
+            <w:tcMar>
+              <w:top w:w="70" w:type="dxa"/>
+              <w:bottom w:w="70" w:type="dxa"/>
+              <w:left w:w="100" w:type="dxa"/>
+              <w:right w:w="100" w:type="dxa"/>
+            </w:tcMar>
+          </w:tcPr>
+          <w:p>
+            <w:r>
+              <w:rPr>
+                <w:rFonts w:ascii="Times New Roman" w:hAnsi="Times New Roman"/>
+                <w:b w:val="0"/>
+                <w:sz w:val="23"/>
+              </w:rPr>
+              <w:t>https://www.kaggle.com/datasets/marusagar/bank-transaction-fraud-detection</w:t>
+            </w:r>
+          </w:p>
+        </w:tc>
+      </w:tr>
+    </w:tbl>
+    <w:p>
+      <w:pPr>
+        <w:spacing w:before="160" w:after="80"/>
+      </w:pPr>
+      <w:r>
+        <w:rPr>
+          <w:rFonts w:ascii="Times New Roman" w:hAnsi="Times New Roman"/>
+          <w:sz w:val="24"/>
+        </w:rPr>
+        <w:t>The complete source code from the executed Jupyter Notebook INT315_Project_CA2.ipynb is organized by functional steps below:</w:t>
       </w:r>
     </w:p>
     <w:p>
       <w:pPr>
         <w:keepNext/>
-        <w:spacing w:before="240" w:after="80"/>
+        <w:spacing w:before="280" w:after="80"/>
       </w:pPr>
       <w:r>
         <w:rPr>
           <w:rFonts w:ascii="Times New Roman" w:hAnsi="Times New Roman"/>
           <w:b/>
-          <w:sz w:val="24"/>
+          <w:sz w:val="26"/>
         </w:rPr>
         <w:t>Step 1: Spark Environment Initialization</w:t>
       </w:r>
@@ -2876,8 +3077,8 @@
             <w:tcMar>
               <w:top w:w="60" w:type="dxa"/>
               <w:bottom w:w="60" w:type="dxa"/>
-              <w:left w:w="80" w:type="dxa"/>
-              <w:right w:w="80" w:type="dxa"/>
+              <w:left w:w="90" w:type="dxa"/>
+              <w:right w:w="90" w:type="dxa"/>
             </w:tcMar>
           </w:tcPr>
           <w:p>
@@ -2887,7 +3088,7 @@
             <w:r>
               <w:rPr>
                 <w:rFonts w:ascii="Courier New" w:hAnsi="Courier New"/>
-                <w:sz w:val="17"/>
+                <w:sz w:val="20"/>
               </w:rPr>
               <w:t>import os</w:t>
               <w:br/>
@@ -2952,13 +3153,13 @@
     <w:p>
       <w:pPr>
         <w:keepNext/>
-        <w:spacing w:before="240" w:after="80"/>
+        <w:spacing w:before="280" w:after="80"/>
       </w:pPr>
       <w:r>
         <w:rPr>
           <w:rFonts w:ascii="Times New Roman" w:hAnsi="Times New Roman"/>
           <w:b/>
-          <w:sz w:val="24"/>
+          <w:sz w:val="26"/>
         </w:rPr>
         <w:t>Step 2: Data Loading and Schema Inspection</w:t>
       </w:r>
@@ -2987,8 +3188,8 @@
             <w:tcMar>
               <w:top w:w="60" w:type="dxa"/>
               <w:bottom w:w="60" w:type="dxa"/>
-              <w:left w:w="80" w:type="dxa"/>
-              <w:right w:w="80" w:type="dxa"/>
+              <w:left w:w="90" w:type="dxa"/>
+              <w:right w:w="90" w:type="dxa"/>
             </w:tcMar>
           </w:tcPr>
           <w:p>
@@ -2998,7 +3199,7 @@
             <w:r>
               <w:rPr>
                 <w:rFonts w:ascii="Courier New" w:hAnsi="Courier New"/>
-                <w:sz w:val="17"/>
+                <w:sz w:val="20"/>
               </w:rPr>
               <w:t># Load CSV dataset into PySpark DataFrame</w:t>
               <w:br/>
@@ -3025,13 +3226,13 @@
     <w:p>
       <w:pPr>
         <w:keepNext/>
-        <w:spacing w:before="240" w:after="80"/>
+        <w:spacing w:before="280" w:after="80"/>
       </w:pPr>
       <w:r>
         <w:rPr>
           <w:rFonts w:ascii="Times New Roman" w:hAnsi="Times New Roman"/>
           <w:b/>
-          <w:sz w:val="24"/>
+          <w:sz w:val="26"/>
         </w:rPr>
         <w:t>Step 3: Data Quality Analysis (Missing Values &amp; Duplicates)</w:t>
       </w:r>
@@ -3060,8 +3261,8 @@
             <w:tcMar>
               <w:top w:w="60" w:type="dxa"/>
               <w:bottom w:w="60" w:type="dxa"/>
-              <w:left w:w="80" w:type="dxa"/>
-              <w:right w:w="80" w:type="dxa"/>
+              <w:left w:w="90" w:type="dxa"/>
+              <w:right w:w="90" w:type="dxa"/>
             </w:tcMar>
           </w:tcPr>
           <w:p>
@@ -3071,7 +3272,7 @@
             <w:r>
               <w:rPr>
                 <w:rFonts w:ascii="Courier New" w:hAnsi="Courier New"/>
-                <w:sz w:val="17"/>
+                <w:sz w:val="20"/>
               </w:rPr>
               <w:t># Audit null values across all columns</w:t>
               <w:br/>
@@ -3107,13 +3308,13 @@
     <w:p>
       <w:pPr>
         <w:keepNext/>
-        <w:spacing w:before="240" w:after="80"/>
+        <w:spacing w:before="280" w:after="80"/>
       </w:pPr>
       <w:r>
         <w:rPr>
           <w:rFonts w:ascii="Times New Roman" w:hAnsi="Times New Roman"/>
           <w:b/>
-          <w:sz w:val="24"/>
+          <w:sz w:val="26"/>
         </w:rPr>
         <w:t>Step 4: Exploratory Data Analysis &amp; Feature Relationships</w:t>
       </w:r>
@@ -3142,8 +3343,8 @@
             <w:tcMar>
               <w:top w:w="60" w:type="dxa"/>
               <w:bottom w:w="60" w:type="dxa"/>
-              <w:left w:w="80" w:type="dxa"/>
-              <w:right w:w="80" w:type="dxa"/>
+              <w:left w:w="90" w:type="dxa"/>
+              <w:right w:w="90" w:type="dxa"/>
             </w:tcMar>
           </w:tcPr>
           <w:p>
@@ -3153,7 +3354,7 @@
             <w:r>
               <w:rPr>
                 <w:rFonts w:ascii="Courier New" w:hAnsi="Courier New"/>
-                <w:sz w:val="17"/>
+                <w:sz w:val="20"/>
               </w:rPr>
               <w:t># Summary statistics of continuous numerical attributes</w:t>
               <w:br/>
@@ -3212,13 +3413,13 @@
     <w:p>
       <w:pPr>
         <w:keepNext/>
-        <w:spacing w:before="240" w:after="80"/>
+        <w:spacing w:before="280" w:after="80"/>
       </w:pPr>
       <w:r>
         <w:rPr>
           <w:rFonts w:ascii="Times New Roman" w:hAnsi="Times New Roman"/>
           <w:b/>
-          <w:sz w:val="24"/>
+          <w:sz w:val="26"/>
         </w:rPr>
         <w:t>Step 5: Feature Engineering &amp; Correlation Heatmap</w:t>
       </w:r>
@@ -3247,8 +3448,8 @@
             <w:tcMar>
               <w:top w:w="60" w:type="dxa"/>
               <w:bottom w:w="60" w:type="dxa"/>
-              <w:left w:w="80" w:type="dxa"/>
-              <w:right w:w="80" w:type="dxa"/>
+              <w:left w:w="90" w:type="dxa"/>
+              <w:right w:w="90" w:type="dxa"/>
             </w:tcMar>
           </w:tcPr>
           <w:p>
@@ -3258,7 +3459,7 @@
             <w:r>
               <w:rPr>
                 <w:rFonts w:ascii="Courier New" w:hAnsi="Courier New"/>
-                <w:sz w:val="17"/>
+                <w:sz w:val="20"/>
               </w:rPr>
               <w:t># Extract hour from timestamp</w:t>
               <w:br/>
@@ -3309,13 +3510,13 @@
     <w:p>
       <w:pPr>
         <w:keepNext/>
-        <w:spacing w:before="240" w:after="80"/>
+        <w:spacing w:before="280" w:after="80"/>
       </w:pPr>
       <w:r>
         <w:rPr>
           <w:rFonts w:ascii="Times New Roman" w:hAnsi="Times New Roman"/>
           <w:b/>
-          <w:sz w:val="24"/>
+          <w:sz w:val="26"/>
         </w:rPr>
         <w:t>Step 6: Unsupervised Learning - K-Means Clustering</w:t>
       </w:r>
@@ -3344,8 +3545,8 @@
             <w:tcMar>
               <w:top w:w="60" w:type="dxa"/>
               <w:bottom w:w="60" w:type="dxa"/>
-              <w:left w:w="80" w:type="dxa"/>
-              <w:right w:w="80" w:type="dxa"/>
+              <w:left w:w="90" w:type="dxa"/>
+              <w:right w:w="90" w:type="dxa"/>
             </w:tcMar>
           </w:tcPr>
           <w:p>
@@ -3355,7 +3556,7 @@
             <w:r>
               <w:rPr>
                 <w:rFonts w:ascii="Courier New" w:hAnsi="Courier New"/>
-                <w:sz w:val="17"/>
+                <w:sz w:val="20"/>
               </w:rPr>
               <w:t>from pyspark.ml.feature import VectorAssembler, StandardScaler</w:t>
               <w:br/>
@@ -3403,13 +3604,13 @@
     <w:p>
       <w:pPr>
         <w:keepNext/>
-        <w:spacing w:before="240" w:after="80"/>
+        <w:spacing w:before="280" w:after="80"/>
       </w:pPr>
       <w:r>
         <w:rPr>
           <w:rFonts w:ascii="Times New Roman" w:hAnsi="Times New Roman"/>
           <w:b/>
-          <w:sz w:val="24"/>
+          <w:sz w:val="26"/>
         </w:rPr>
         <w:t>Step 7: Categorical Encoding &amp; Dataset Partitioning</w:t>
       </w:r>
@@ -3438,8 +3639,8 @@
             <w:tcMar>
               <w:top w:w="60" w:type="dxa"/>
               <w:bottom w:w="60" w:type="dxa"/>
-              <w:left w:w="80" w:type="dxa"/>
-              <w:right w:w="80" w:type="dxa"/>
+              <w:left w:w="90" w:type="dxa"/>
+              <w:right w:w="90" w:type="dxa"/>
             </w:tcMar>
           </w:tcPr>
           <w:p>
@@ -3449,7 +3650,7 @@
             <w:r>
               <w:rPr>
                 <w:rFonts w:ascii="Courier New" w:hAnsi="Courier New"/>
-                <w:sz w:val="17"/>
+                <w:sz w:val="20"/>
               </w:rPr>
               <w:t>from pyspark.ml.feature import StringIndexer, OneHotEncoder</w:t>
               <w:br/>
@@ -3481,13 +3682,13 @@
     <w:p>
       <w:pPr>
         <w:keepNext/>
-        <w:spacing w:before="240" w:after="80"/>
+        <w:spacing w:before="280" w:after="80"/>
       </w:pPr>
       <w:r>
         <w:rPr>
           <w:rFonts w:ascii="Times New Roman" w:hAnsi="Times New Roman"/>
           <w:b/>
-          <w:sz w:val="24"/>
+          <w:sz w:val="26"/>
         </w:rPr>
         <w:t>Step 8: Supervised Regression - Linear Regression</w:t>
       </w:r>
@@ -3516,8 +3717,8 @@
             <w:tcMar>
               <w:top w:w="60" w:type="dxa"/>
               <w:bottom w:w="60" w:type="dxa"/>
-              <w:left w:w="80" w:type="dxa"/>
-              <w:right w:w="80" w:type="dxa"/>
+              <w:left w:w="90" w:type="dxa"/>
+              <w:right w:w="90" w:type="dxa"/>
             </w:tcMar>
           </w:tcPr>
           <w:p>
@@ -3527,7 +3728,7 @@
             <w:r>
               <w:rPr>
                 <w:rFonts w:ascii="Courier New" w:hAnsi="Courier New"/>
-                <w:sz w:val="17"/>
+                <w:sz w:val="20"/>
               </w:rPr>
               <w:t>from pyspark.ml.regression import LinearRegression</w:t>
               <w:br/>
@@ -3601,13 +3802,13 @@
     <w:p>
       <w:pPr>
         <w:keepNext/>
-        <w:spacing w:before="240" w:after="80"/>
+        <w:spacing w:before="280" w:after="80"/>
       </w:pPr>
       <w:r>
         <w:rPr>
           <w:rFonts w:ascii="Times New Roman" w:hAnsi="Times New Roman"/>
           <w:b/>
-          <w:sz w:val="24"/>
+          <w:sz w:val="26"/>
         </w:rPr>
         <w:t>Step 9: Supervised Classification - Fraud Detection Models</w:t>
       </w:r>
@@ -3636,8 +3837,8 @@
             <w:tcMar>
               <w:top w:w="60" w:type="dxa"/>
               <w:bottom w:w="60" w:type="dxa"/>
-              <w:left w:w="80" w:type="dxa"/>
-              <w:right w:w="80" w:type="dxa"/>
+              <w:left w:w="90" w:type="dxa"/>
+              <w:right w:w="90" w:type="dxa"/>
             </w:tcMar>
           </w:tcPr>
           <w:p>
@@ -3647,7 +3848,7 @@
             <w:r>
               <w:rPr>
                 <w:rFonts w:ascii="Courier New" w:hAnsi="Courier New"/>
-                <w:sz w:val="17"/>
+                <w:sz w:val="20"/>
               </w:rPr>
               <w:t>from pyspark.ml.classification import LogisticRegression, DecisionTreeClassifier, LinearSVC, NaiveBayes</w:t>
               <w:br/>
@@ -3707,13 +3908,13 @@
     <w:p>
       <w:pPr>
         <w:keepNext/>
-        <w:spacing w:before="240" w:after="80"/>
+        <w:spacing w:before="280" w:after="80"/>
       </w:pPr>
       <w:r>
         <w:rPr>
           <w:rFonts w:ascii="Times New Roman" w:hAnsi="Times New Roman"/>
           <w:b/>
-          <w:sz w:val="24"/>
+          <w:sz w:val="26"/>
         </w:rPr>
         <w:t>Step 10: Performance Matrix &amp; Confusion Matrix</w:t>
       </w:r>
@@ -3742,8 +3943,8 @@
             <w:tcMar>
               <w:top w:w="60" w:type="dxa"/>
               <w:bottom w:w="60" w:type="dxa"/>
-              <w:left w:w="80" w:type="dxa"/>
-              <w:right w:w="80" w:type="dxa"/>
+              <w:left w:w="90" w:type="dxa"/>
+              <w:right w:w="90" w:type="dxa"/>
             </w:tcMar>
           </w:tcPr>
           <w:p>
@@ -3753,7 +3954,7 @@
             <w:r>
               <w:rPr>
                 <w:rFonts w:ascii="Courier New" w:hAnsi="Courier New"/>
-                <w:sz w:val="17"/>
+                <w:sz w:val="20"/>
               </w:rPr>
               <w:t>from pyspark.ml.evaluation import MulticlassClassificationEvaluator</w:t>
               <w:br/>
@@ -3858,7 +4059,7 @@
         <w:rPr>
           <w:rFonts w:ascii="Times New Roman" w:hAnsi="Times New Roman"/>
           <w:b/>
-          <w:sz w:val="28"/>
+          <w:sz w:val="30"/>
         </w:rPr>
         <w:t>9. Execution Screenshots &amp; Recorded Outputs</w:t>
       </w:r>
@@ -3871,13 +4072,13 @@
     <w:p>
       <w:pPr>
         <w:keepNext/>
-        <w:spacing w:before="240" w:after="80"/>
+        <w:spacing w:before="280" w:after="80"/>
       </w:pPr>
       <w:r>
         <w:rPr>
           <w:rFonts w:ascii="Times New Roman" w:hAnsi="Times New Roman"/>
           <w:b/>
-          <w:sz w:val="24"/>
+          <w:sz w:val="26"/>
         </w:rPr>
         <w:t>Output 1: SparkSession Runtime Setup</w:t>
       </w:r>
@@ -3917,7 +4118,7 @@
             <w:r>
               <w:rPr>
                 <w:rFonts w:ascii="Courier New" w:hAnsi="Courier New"/>
-                <w:sz w:val="17"/>
+                <w:sz w:val="19"/>
               </w:rPr>
               <w:t>SparkSession initialized successfully!</w:t>
               <w:br/>
@@ -3939,13 +4140,13 @@
     <w:p>
       <w:pPr>
         <w:keepNext/>
-        <w:spacing w:before="240" w:after="80"/>
+        <w:spacing w:before="280" w:after="80"/>
       </w:pPr>
       <w:r>
         <w:rPr>
           <w:rFonts w:ascii="Times New Roman" w:hAnsi="Times New Roman"/>
           <w:b/>
-          <w:sz w:val="24"/>
+          <w:sz w:val="26"/>
         </w:rPr>
         <w:t>Output 2: Dataset Dimensions &amp; Schema</w:t>
       </w:r>
@@ -3985,7 +4186,7 @@
             <w:r>
               <w:rPr>
                 <w:rFonts w:ascii="Courier New" w:hAnsi="Courier New"/>
-                <w:sz w:val="17"/>
+                <w:sz w:val="19"/>
               </w:rPr>
               <w:t>Total Rows    : 200,000</w:t>
               <w:br/>
@@ -4027,13 +4228,13 @@
     <w:p>
       <w:pPr>
         <w:keepNext/>
-        <w:spacing w:before="240" w:after="80"/>
+        <w:spacing w:before="280" w:after="80"/>
       </w:pPr>
       <w:r>
         <w:rPr>
           <w:rFonts w:ascii="Times New Roman" w:hAnsi="Times New Roman"/>
           <w:b/>
-          <w:sz w:val="24"/>
+          <w:sz w:val="26"/>
         </w:rPr>
         <w:t>Output 3: Data Quality Verification (Missing &amp; Duplicate Audit)</w:t>
       </w:r>
@@ -4073,7 +4274,7 @@
             <w:r>
               <w:rPr>
                 <w:rFonts w:ascii="Courier New" w:hAnsi="Courier New"/>
-                <w:sz w:val="17"/>
+                <w:sz w:val="19"/>
               </w:rPr>
               <w:t>+-----------+---+------+------------+---------------+----------------+------------------+----------------+-----------------+-----------+--------+</w:t>
               <w:br/>
@@ -4104,13 +4305,13 @@
     <w:p>
       <w:pPr>
         <w:keepNext/>
-        <w:spacing w:before="240" w:after="80"/>
+        <w:spacing w:before="280" w:after="80"/>
       </w:pPr>
       <w:r>
         <w:rPr>
           <w:rFonts w:ascii="Times New Roman" w:hAnsi="Times New Roman"/>
           <w:b/>
-          <w:sz w:val="24"/>
+          <w:sz w:val="26"/>
         </w:rPr>
         <w:t>Output 4: Descriptive Statistics &amp; Class Imbalance</w:t>
       </w:r>
@@ -4150,7 +4351,7 @@
             <w:r>
               <w:rPr>
                 <w:rFonts w:ascii="Courier New" w:hAnsi="Courier New"/>
-                <w:sz w:val="17"/>
+                <w:sz w:val="19"/>
               </w:rPr>
               <w:t>+-------+------------------+------------------+------------------+</w:t>
               <w:br/>
@@ -4195,13 +4396,13 @@
     <w:p>
       <w:pPr>
         <w:keepNext/>
-        <w:spacing w:before="240" w:after="80"/>
+        <w:spacing w:before="280" w:after="80"/>
       </w:pPr>
       <w:r>
         <w:rPr>
           <w:rFonts w:ascii="Times New Roman" w:hAnsi="Times New Roman"/>
           <w:b/>
-          <w:sz w:val="24"/>
+          <w:sz w:val="26"/>
         </w:rPr>
         <w:t>Output 5: Dataset Split Records</w:t>
       </w:r>
@@ -4241,7 +4442,7 @@
             <w:r>
               <w:rPr>
                 <w:rFonts w:ascii="Courier New" w:hAnsi="Courier New"/>
-                <w:sz w:val="17"/>
+                <w:sz w:val="19"/>
               </w:rPr>
               <w:t>Training Dataset Record Count : 160,049 records (80%)</w:t>
               <w:br/>
@@ -4267,70 +4468,368 @@
         <w:rPr>
           <w:rFonts w:ascii="Times New Roman" w:hAnsi="Times New Roman"/>
           <w:b/>
-          <w:sz w:val="28"/>
+          <w:sz w:val="30"/>
         </w:rPr>
-        <w:t>10. Output / Result Screenshots</w:t>
+        <w:t>10. Output / Result Screenshots (Charts &amp; Plots)</w:t>
       </w:r>
     </w:p>
     <w:p>
       <w:r>
-        <w:t>The charts generated from the PySpark pipeline in INT315_Project_CA2.ipynb are displayed below, along with the performance evaluation matrix.</w:t>
+        <w:t>The charts and graphical outputs generated from the PySpark distributed pipeline in INT315_Project_CA2.ipynb are displayed below, along with the performance evaluation matrix.</w:t>
       </w:r>
     </w:p>
     <w:p>
       <w:pPr>
         <w:keepNext/>
-        <w:spacing w:before="240" w:after="80"/>
+        <w:spacing w:before="280" w:after="80"/>
       </w:pPr>
       <w:r>
         <w:rPr>
           <w:rFonts w:ascii="Times New Roman" w:hAnsi="Times New Roman"/>
           <w:b/>
-          <w:sz w:val="24"/>
+          <w:sz w:val="26"/>
         </w:rPr>
-        <w:t>10.1 Correlation Heatmap of Numerical Features</w:t>
+        <w:t>10.1 Target Class Distribution: Legitimate vs. Fraudulent Transactions</w:t>
+      </w:r>
+    </w:p>
+    <w:p>
+      <w:pPr>
+        <w:spacing w:before="120" w:after="80"/>
+        <w:jc w:val="center"/>
+      </w:pPr>
+      <w:r>
+        <w:drawing>
+          <wp:inline xmlns:a="http://schemas.openxmlformats.org/drawingml/2006/main" xmlns:pic="http://schemas.openxmlformats.org/drawingml/2006/picture">
+            <wp:extent cx="4846320" cy="3230880"/>
+            <wp:docPr id="1" name="Picture 1"/>
+            <wp:cNvGraphicFramePr>
+              <a:graphicFrameLocks noChangeAspect="1"/>
+            </wp:cNvGraphicFramePr>
+            <a:graphic>
+              <a:graphicData uri="http://schemas.openxmlformats.org/drawingml/2006/picture">
+                <pic:pic>
+                  <pic:nvPicPr>
+                    <pic:cNvPr id="0" name="chart_class_distribution.png"/>
+                    <pic:cNvPicPr/>
+                  </pic:nvPicPr>
+                  <pic:blipFill>
+                    <a:blip r:embed="rId9"/>
+                    <a:stretch>
+                      <a:fillRect/>
+                    </a:stretch>
+                  </pic:blipFill>
+                  <pic:spPr>
+                    <a:xfrm>
+                      <a:off x="0" y="0"/>
+                      <a:ext cx="4846320" cy="3230880"/>
+                    </a:xfrm>
+                    <a:prstGeom prst="rect"/>
+                  </pic:spPr>
+                </pic:pic>
+              </a:graphicData>
+            </a:graphic>
+          </wp:inline>
+        </w:drawing>
+      </w:r>
+    </w:p>
+    <w:p>
+      <w:pPr>
+        <w:spacing w:before="40" w:after="240"/>
+        <w:jc w:val="center"/>
+      </w:pPr>
+      <w:r>
+        <w:rPr>
+          <w:rFonts w:ascii="Times New Roman" w:hAnsi="Times New Roman"/>
+          <w:i/>
+          <w:sz w:val="22"/>
+        </w:rPr>
+        <w:t>Figure 1: Target class distribution showing 189,912 Legitimate Transactions (94.96%) and 10,088 Fraudulent Transactions (5.04%).</w:t>
       </w:r>
     </w:p>
     <w:p>
       <w:pPr>
         <w:keepNext/>
-        <w:spacing w:before="240" w:after="80"/>
+        <w:spacing w:before="280" w:after="80"/>
       </w:pPr>
       <w:r>
         <w:rPr>
           <w:rFonts w:ascii="Times New Roman" w:hAnsi="Times New Roman"/>
           <w:b/>
-          <w:sz w:val="24"/>
+          <w:sz w:val="26"/>
         </w:rPr>
-        <w:t>10.2 Actual vs. Predicted Transaction Amount (Linear Regression)</w:t>
+        <w:t>10.2 Fraud Occurrence Rate Across Transaction Modes</w:t>
+      </w:r>
+    </w:p>
+    <w:p>
+      <w:pPr>
+        <w:spacing w:before="120" w:after="80"/>
+        <w:jc w:val="center"/>
+      </w:pPr>
+      <w:r>
+        <w:drawing>
+          <wp:inline xmlns:a="http://schemas.openxmlformats.org/drawingml/2006/main" xmlns:pic="http://schemas.openxmlformats.org/drawingml/2006/picture">
+            <wp:extent cx="5029200" cy="2873829"/>
+            <wp:docPr id="2" name="Picture 2"/>
+            <wp:cNvGraphicFramePr>
+              <a:graphicFrameLocks noChangeAspect="1"/>
+            </wp:cNvGraphicFramePr>
+            <a:graphic>
+              <a:graphicData uri="http://schemas.openxmlformats.org/drawingml/2006/picture">
+                <pic:pic>
+                  <pic:nvPicPr>
+                    <pic:cNvPr id="0" name="chart_fraud_by_channel.png"/>
+                    <pic:cNvPicPr/>
+                  </pic:nvPicPr>
+                  <pic:blipFill>
+                    <a:blip r:embed="rId10"/>
+                    <a:stretch>
+                      <a:fillRect/>
+                    </a:stretch>
+                  </pic:blipFill>
+                  <pic:spPr>
+                    <a:xfrm>
+                      <a:off x="0" y="0"/>
+                      <a:ext cx="5029200" cy="2873829"/>
+                    </a:xfrm>
+                    <a:prstGeom prst="rect"/>
+                  </pic:spPr>
+                </pic:pic>
+              </a:graphicData>
+            </a:graphic>
+          </wp:inline>
+        </w:drawing>
+      </w:r>
+    </w:p>
+    <w:p>
+      <w:pPr>
+        <w:spacing w:before="40" w:after="240"/>
+        <w:jc w:val="center"/>
+      </w:pPr>
+      <w:r>
+        <w:rPr>
+          <w:rFonts w:ascii="Times New Roman" w:hAnsi="Times New Roman"/>
+          <w:i/>
+          <w:sz w:val="22"/>
+        </w:rPr>
+        <w:t>Figure 2: Percentage of fraud occurrences across Transfer, Bill Payment, Debit, Credit, and Withdrawal channels.</w:t>
       </w:r>
     </w:p>
     <w:p>
       <w:pPr>
         <w:keepNext/>
-        <w:spacing w:before="240" w:after="80"/>
+        <w:spacing w:before="280" w:after="80"/>
       </w:pPr>
       <w:r>
         <w:rPr>
           <w:rFonts w:ascii="Times New Roman" w:hAnsi="Times New Roman"/>
           <w:b/>
-          <w:sz w:val="24"/>
+          <w:sz w:val="26"/>
         </w:rPr>
-        <w:t>10.3 Confusion Matrix for Fraud Detection (Logistic Regression)</w:t>
+        <w:t>10.3 Pearson Correlation Heatmap of Numerical Features</w:t>
+      </w:r>
+    </w:p>
+    <w:p>
+      <w:pPr>
+        <w:spacing w:before="120" w:after="80"/>
+        <w:jc w:val="center"/>
+      </w:pPr>
+      <w:r>
+        <w:drawing>
+          <wp:inline xmlns:a="http://schemas.openxmlformats.org/drawingml/2006/main" xmlns:pic="http://schemas.openxmlformats.org/drawingml/2006/picture">
+            <wp:extent cx="4846320" cy="3822632"/>
+            <wp:docPr id="3" name="Picture 3"/>
+            <wp:cNvGraphicFramePr>
+              <a:graphicFrameLocks noChangeAspect="1"/>
+            </wp:cNvGraphicFramePr>
+            <a:graphic>
+              <a:graphicData uri="http://schemas.openxmlformats.org/drawingml/2006/picture">
+                <pic:pic>
+                  <pic:nvPicPr>
+                    <pic:cNvPr id="0" name="chart_cell_10_output_0.png"/>
+                    <pic:cNvPicPr/>
+                  </pic:nvPicPr>
+                  <pic:blipFill>
+                    <a:blip r:embed="rId11"/>
+                    <a:stretch>
+                      <a:fillRect/>
+                    </a:stretch>
+                  </pic:blipFill>
+                  <pic:spPr>
+                    <a:xfrm>
+                      <a:off x="0" y="0"/>
+                      <a:ext cx="4846320" cy="3822632"/>
+                    </a:xfrm>
+                    <a:prstGeom prst="rect"/>
+                  </pic:spPr>
+                </pic:pic>
+              </a:graphicData>
+            </a:graphic>
+          </wp:inline>
+        </w:drawing>
+      </w:r>
+    </w:p>
+    <w:p>
+      <w:pPr>
+        <w:spacing w:before="40" w:after="240"/>
+        <w:jc w:val="center"/>
+      </w:pPr>
+      <w:r>
+        <w:rPr>
+          <w:rFonts w:ascii="Times New Roman" w:hAnsi="Times New Roman"/>
+          <w:i/>
+          <w:sz w:val="22"/>
+        </w:rPr>
+        <w:t>Figure 3: Pearson Correlation Heatmap for numerical features (Age, Account_Balance, Transaction_Hour, Transaction_Amount, Is_Fraud).</w:t>
       </w:r>
     </w:p>
     <w:p>
       <w:pPr>
         <w:keepNext/>
-        <w:spacing w:before="240" w:after="80"/>
+        <w:spacing w:before="280" w:after="80"/>
       </w:pPr>
       <w:r>
         <w:rPr>
           <w:rFonts w:ascii="Times New Roman" w:hAnsi="Times New Roman"/>
           <w:b/>
-          <w:sz w:val="24"/>
+          <w:sz w:val="26"/>
         </w:rPr>
-        <w:t>10.4 Machine Learning Model Evaluation Matrix</w:t>
+        <w:t>10.4 Actual vs. Predicted Transaction Amount (Linear Regression)</w:t>
+      </w:r>
+    </w:p>
+    <w:p>
+      <w:pPr>
+        <w:spacing w:before="120" w:after="80"/>
+        <w:jc w:val="center"/>
+      </w:pPr>
+      <w:r>
+        <w:drawing>
+          <wp:inline xmlns:a="http://schemas.openxmlformats.org/drawingml/2006/main" xmlns:pic="http://schemas.openxmlformats.org/drawingml/2006/picture">
+            <wp:extent cx="4846320" cy="3013575"/>
+            <wp:docPr id="4" name="Picture 4"/>
+            <wp:cNvGraphicFramePr>
+              <a:graphicFrameLocks noChangeAspect="1"/>
+            </wp:cNvGraphicFramePr>
+            <a:graphic>
+              <a:graphicData uri="http://schemas.openxmlformats.org/drawingml/2006/picture">
+                <pic:pic>
+                  <pic:nvPicPr>
+                    <pic:cNvPr id="0" name="chart_cell_16_output_1.png"/>
+                    <pic:cNvPicPr/>
+                  </pic:nvPicPr>
+                  <pic:blipFill>
+                    <a:blip r:embed="rId12"/>
+                    <a:stretch>
+                      <a:fillRect/>
+                    </a:stretch>
+                  </pic:blipFill>
+                  <pic:spPr>
+                    <a:xfrm>
+                      <a:off x="0" y="0"/>
+                      <a:ext cx="4846320" cy="3013575"/>
+                    </a:xfrm>
+                    <a:prstGeom prst="rect"/>
+                  </pic:spPr>
+                </pic:pic>
+              </a:graphicData>
+            </a:graphic>
+          </wp:inline>
+        </w:drawing>
+      </w:r>
+    </w:p>
+    <w:p>
+      <w:pPr>
+        <w:spacing w:before="40" w:after="240"/>
+        <w:jc w:val="center"/>
+      </w:pPr>
+      <w:r>
+        <w:rPr>
+          <w:rFonts w:ascii="Times New Roman" w:hAnsi="Times New Roman"/>
+          <w:i/>
+          <w:sz w:val="22"/>
+        </w:rPr>
+        <w:t>Figure 4: Actual vs. Predicted Transaction Amount scatter plot with red diagonal reference line (y = x).</w:t>
+      </w:r>
+    </w:p>
+    <w:p>
+      <w:pPr>
+        <w:keepNext/>
+        <w:spacing w:before="280" w:after="80"/>
+      </w:pPr>
+      <w:r>
+        <w:rPr>
+          <w:rFonts w:ascii="Times New Roman" w:hAnsi="Times New Roman"/>
+          <w:b/>
+          <w:sz w:val="26"/>
+        </w:rPr>
+        <w:t>10.5 Confusion Matrix for Fraud Detection (Logistic Regression)</w:t>
+      </w:r>
+    </w:p>
+    <w:p>
+      <w:pPr>
+        <w:spacing w:before="120" w:after="80"/>
+        <w:jc w:val="center"/>
+      </w:pPr>
+      <w:r>
+        <w:drawing>
+          <wp:inline xmlns:a="http://schemas.openxmlformats.org/drawingml/2006/main" xmlns:pic="http://schemas.openxmlformats.org/drawingml/2006/picture">
+            <wp:extent cx="4206240" cy="3547431"/>
+            <wp:docPr id="5" name="Picture 5"/>
+            <wp:cNvGraphicFramePr>
+              <a:graphicFrameLocks noChangeAspect="1"/>
+            </wp:cNvGraphicFramePr>
+            <a:graphic>
+              <a:graphicData uri="http://schemas.openxmlformats.org/drawingml/2006/picture">
+                <pic:pic>
+                  <pic:nvPicPr>
+                    <pic:cNvPr id="0" name="chart_cell_20_output_1.png"/>
+                    <pic:cNvPicPr/>
+                  </pic:nvPicPr>
+                  <pic:blipFill>
+                    <a:blip r:embed="rId13"/>
+                    <a:stretch>
+                      <a:fillRect/>
+                    </a:stretch>
+                  </pic:blipFill>
+                  <pic:spPr>
+                    <a:xfrm>
+                      <a:off x="0" y="0"/>
+                      <a:ext cx="4206240" cy="3547431"/>
+                    </a:xfrm>
+                    <a:prstGeom prst="rect"/>
+                  </pic:spPr>
+                </pic:pic>
+              </a:graphicData>
+            </a:graphic>
+          </wp:inline>
+        </w:drawing>
+      </w:r>
+    </w:p>
+    <w:p>
+      <w:pPr>
+        <w:spacing w:before="40" w:after="240"/>
+        <w:jc w:val="center"/>
+      </w:pPr>
+      <w:r>
+        <w:rPr>
+          <w:rFonts w:ascii="Times New Roman" w:hAnsi="Times New Roman"/>
+          <w:i/>
+          <w:sz w:val="22"/>
+        </w:rPr>
+        <w:t>Figure 5: Confusion Matrix Heatmap for Logistic Regression evaluated on 39,951 test records.</w:t>
+      </w:r>
+    </w:p>
+    <w:p>
+      <w:pPr>
+        <w:keepNext/>
+        <w:spacing w:before="280" w:after="80"/>
+      </w:pPr>
+      <w:r>
+        <w:rPr>
+          <w:rFonts w:ascii="Times New Roman" w:hAnsi="Times New Roman"/>
+          <w:b/>
+          <w:sz w:val="26"/>
+        </w:rPr>
+        <w:t>10.6 Machine Learning Model Evaluation Matrix</w:t>
       </w:r>
     </w:p>
     <w:tbl>
@@ -4358,10 +4857,10 @@
           <w:tcPr>
             <w:tcW w:type="dxa" w:w="2340"/>
             <w:tcMar>
-              <w:top w:w="60" w:type="dxa"/>
-              <w:bottom w:w="60" w:type="dxa"/>
-              <w:left w:w="80" w:type="dxa"/>
-              <w:right w:w="80" w:type="dxa"/>
+              <w:top w:w="80" w:type="dxa"/>
+              <w:bottom w:w="80" w:type="dxa"/>
+              <w:left w:w="100" w:type="dxa"/>
+              <w:right w:w="100" w:type="dxa"/>
             </w:tcMar>
           </w:tcPr>
           <w:p>
@@ -4369,7 +4868,7 @@
               <w:rPr>
                 <w:rFonts w:ascii="Times New Roman" w:hAnsi="Times New Roman"/>
                 <w:b/>
-                <w:sz w:val="20"/>
+                <w:sz w:val="24"/>
               </w:rPr>
               <w:t>Algorithm / Model</w:t>
             </w:r>
@@ -4379,10 +4878,10 @@
           <w:tcPr>
             <w:tcW w:type="dxa" w:w="2340"/>
             <w:tcMar>
-              <w:top w:w="60" w:type="dxa"/>
-              <w:bottom w:w="60" w:type="dxa"/>
-              <w:left w:w="80" w:type="dxa"/>
-              <w:right w:w="80" w:type="dxa"/>
+              <w:top w:w="80" w:type="dxa"/>
+              <w:bottom w:w="80" w:type="dxa"/>
+              <w:left w:w="100" w:type="dxa"/>
+              <w:right w:w="100" w:type="dxa"/>
             </w:tcMar>
           </w:tcPr>
           <w:p>
@@ -4390,7 +4889,7 @@
               <w:rPr>
                 <w:rFonts w:ascii="Times New Roman" w:hAnsi="Times New Roman"/>
                 <w:b/>
-                <w:sz w:val="20"/>
+                <w:sz w:val="24"/>
               </w:rPr>
               <w:t>Learning Paradigm</w:t>
             </w:r>
@@ -4400,10 +4899,10 @@
           <w:tcPr>
             <w:tcW w:type="dxa" w:w="2340"/>
             <w:tcMar>
-              <w:top w:w="60" w:type="dxa"/>
-              <w:bottom w:w="60" w:type="dxa"/>
-              <w:left w:w="80" w:type="dxa"/>
-              <w:right w:w="80" w:type="dxa"/>
+              <w:top w:w="80" w:type="dxa"/>
+              <w:bottom w:w="80" w:type="dxa"/>
+              <w:left w:w="100" w:type="dxa"/>
+              <w:right w:w="100" w:type="dxa"/>
             </w:tcMar>
           </w:tcPr>
           <w:p>
@@ -4411,7 +4910,7 @@
               <w:rPr>
                 <w:rFonts w:ascii="Times New Roman" w:hAnsi="Times New Roman"/>
                 <w:b/>
-                <w:sz w:val="20"/>
+                <w:sz w:val="24"/>
               </w:rPr>
               <w:t>Target Variable</w:t>
             </w:r>
@@ -4421,10 +4920,10 @@
           <w:tcPr>
             <w:tcW w:type="dxa" w:w="2340"/>
             <w:tcMar>
-              <w:top w:w="60" w:type="dxa"/>
-              <w:bottom w:w="60" w:type="dxa"/>
-              <w:left w:w="80" w:type="dxa"/>
-              <w:right w:w="80" w:type="dxa"/>
+              <w:top w:w="80" w:type="dxa"/>
+              <w:bottom w:w="80" w:type="dxa"/>
+              <w:left w:w="100" w:type="dxa"/>
+              <w:right w:w="100" w:type="dxa"/>
             </w:tcMar>
           </w:tcPr>
           <w:p>
@@ -4432,7 +4931,7 @@
               <w:rPr>
                 <w:rFonts w:ascii="Times New Roman" w:hAnsi="Times New Roman"/>
                 <w:b/>
-                <w:sz w:val="20"/>
+                <w:sz w:val="24"/>
               </w:rPr>
               <w:t>Recorded Performance Metric</w:t>
             </w:r>
@@ -4444,17 +4943,17 @@
           <w:tcPr>
             <w:tcW w:type="dxa" w:w="2340"/>
             <w:tcMar>
-              <w:top w:w="50" w:type="dxa"/>
-              <w:bottom w:w="50" w:type="dxa"/>
-              <w:left w:w="80" w:type="dxa"/>
-              <w:right w:w="80" w:type="dxa"/>
+              <w:top w:w="60" w:type="dxa"/>
+              <w:bottom w:w="60" w:type="dxa"/>
+              <w:left w:w="100" w:type="dxa"/>
+              <w:right w:w="100" w:type="dxa"/>
             </w:tcMar>
           </w:tcPr>
           <w:p>
             <w:r>
               <w:rPr>
                 <w:rFonts w:ascii="Times New Roman" w:hAnsi="Times New Roman"/>
-                <w:sz w:val="19"/>
+                <w:sz w:val="23"/>
               </w:rPr>
               <w:t>K-Means Clustering (k=3)</w:t>
             </w:r>
@@ -4464,17 +4963,17 @@
           <w:tcPr>
             <w:tcW w:type="dxa" w:w="2340"/>
             <w:tcMar>
-              <w:top w:w="50" w:type="dxa"/>
-              <w:bottom w:w="50" w:type="dxa"/>
-              <w:left w:w="80" w:type="dxa"/>
-              <w:right w:w="80" w:type="dxa"/>
+              <w:top w:w="60" w:type="dxa"/>
+              <w:bottom w:w="60" w:type="dxa"/>
+              <w:left w:w="100" w:type="dxa"/>
+              <w:right w:w="100" w:type="dxa"/>
             </w:tcMar>
           </w:tcPr>
           <w:p>
             <w:r>
               <w:rPr>
                 <w:rFonts w:ascii="Times New Roman" w:hAnsi="Times New Roman"/>
-                <w:sz w:val="19"/>
+                <w:sz w:val="23"/>
               </w:rPr>
               <w:t>Unsupervised Clustering</w:t>
             </w:r>
@@ -4484,17 +4983,17 @@
           <w:tcPr>
             <w:tcW w:type="dxa" w:w="2340"/>
             <w:tcMar>
-              <w:top w:w="50" w:type="dxa"/>
-              <w:bottom w:w="50" w:type="dxa"/>
-              <w:left w:w="80" w:type="dxa"/>
-              <w:right w:w="80" w:type="dxa"/>
+              <w:top w:w="60" w:type="dxa"/>
+              <w:bottom w:w="60" w:type="dxa"/>
+              <w:left w:w="100" w:type="dxa"/>
+              <w:right w:w="100" w:type="dxa"/>
             </w:tcMar>
           </w:tcPr>
           <w:p>
             <w:r>
               <w:rPr>
                 <w:rFonts w:ascii="Times New Roman" w:hAnsi="Times New Roman"/>
-                <w:sz w:val="19"/>
+                <w:sz w:val="23"/>
               </w:rPr>
               <w:t>Customer Segmentation</w:t>
             </w:r>
@@ -4504,17 +5003,17 @@
           <w:tcPr>
             <w:tcW w:type="dxa" w:w="2340"/>
             <w:tcMar>
-              <w:top w:w="50" w:type="dxa"/>
-              <w:bottom w:w="50" w:type="dxa"/>
-              <w:left w:w="80" w:type="dxa"/>
-              <w:right w:w="80" w:type="dxa"/>
+              <w:top w:w="60" w:type="dxa"/>
+              <w:bottom w:w="60" w:type="dxa"/>
+              <w:left w:w="100" w:type="dxa"/>
+              <w:right w:w="100" w:type="dxa"/>
             </w:tcMar>
           </w:tcPr>
           <w:p>
             <w:r>
               <w:rPr>
                 <w:rFonts w:ascii="Times New Roman" w:hAnsi="Times New Roman"/>
-                <w:sz w:val="19"/>
+                <w:sz w:val="23"/>
               </w:rPr>
               <w:t>Silhouette Score = 0.2822 (Squared Euclidean)</w:t>
             </w:r>
@@ -4526,17 +5025,17 @@
           <w:tcPr>
             <w:tcW w:type="dxa" w:w="2340"/>
             <w:tcMar>
-              <w:top w:w="50" w:type="dxa"/>
-              <w:bottom w:w="50" w:type="dxa"/>
-              <w:left w:w="80" w:type="dxa"/>
-              <w:right w:w="80" w:type="dxa"/>
+              <w:top w:w="60" w:type="dxa"/>
+              <w:bottom w:w="60" w:type="dxa"/>
+              <w:left w:w="100" w:type="dxa"/>
+              <w:right w:w="100" w:type="dxa"/>
             </w:tcMar>
           </w:tcPr>
           <w:p>
             <w:r>
               <w:rPr>
                 <w:rFonts w:ascii="Times New Roman" w:hAnsi="Times New Roman"/>
-                <w:sz w:val="19"/>
+                <w:sz w:val="23"/>
               </w:rPr>
               <w:t>Linear Regression</w:t>
             </w:r>
@@ -4546,17 +5045,17 @@
           <w:tcPr>
             <w:tcW w:type="dxa" w:w="2340"/>
             <w:tcMar>
-              <w:top w:w="50" w:type="dxa"/>
-              <w:bottom w:w="50" w:type="dxa"/>
-              <w:left w:w="80" w:type="dxa"/>
-              <w:right w:w="80" w:type="dxa"/>
+              <w:top w:w="60" w:type="dxa"/>
+              <w:bottom w:w="60" w:type="dxa"/>
+              <w:left w:w="100" w:type="dxa"/>
+              <w:right w:w="100" w:type="dxa"/>
             </w:tcMar>
           </w:tcPr>
           <w:p>
             <w:r>
               <w:rPr>
                 <w:rFonts w:ascii="Times New Roman" w:hAnsi="Times New Roman"/>
-                <w:sz w:val="19"/>
+                <w:sz w:val="23"/>
               </w:rPr>
               <w:t>Supervised Regression</w:t>
             </w:r>
@@ -4566,17 +5065,17 @@
           <w:tcPr>
             <w:tcW w:type="dxa" w:w="2340"/>
             <w:tcMar>
-              <w:top w:w="50" w:type="dxa"/>
-              <w:bottom w:w="50" w:type="dxa"/>
-              <w:left w:w="80" w:type="dxa"/>
-              <w:right w:w="80" w:type="dxa"/>
+              <w:top w:w="60" w:type="dxa"/>
+              <w:bottom w:w="60" w:type="dxa"/>
+              <w:left w:w="100" w:type="dxa"/>
+              <w:right w:w="100" w:type="dxa"/>
             </w:tcMar>
           </w:tcPr>
           <w:p>
             <w:r>
               <w:rPr>
                 <w:rFonts w:ascii="Times New Roman" w:hAnsi="Times New Roman"/>
-                <w:sz w:val="19"/>
+                <w:sz w:val="23"/>
               </w:rPr>
               <w:t>Transaction_Amount (INR)</w:t>
             </w:r>
@@ -4586,17 +5085,17 @@
           <w:tcPr>
             <w:tcW w:type="dxa" w:w="2340"/>
             <w:tcMar>
-              <w:top w:w="50" w:type="dxa"/>
-              <w:bottom w:w="50" w:type="dxa"/>
-              <w:left w:w="80" w:type="dxa"/>
-              <w:right w:w="80" w:type="dxa"/>
+              <w:top w:w="60" w:type="dxa"/>
+              <w:bottom w:w="60" w:type="dxa"/>
+              <w:left w:w="100" w:type="dxa"/>
+              <w:right w:w="100" w:type="dxa"/>
             </w:tcMar>
           </w:tcPr>
           <w:p>
             <w:r>
               <w:rPr>
                 <w:rFonts w:ascii="Times New Roman" w:hAnsi="Times New Roman"/>
-                <w:sz w:val="19"/>
+                <w:sz w:val="23"/>
               </w:rPr>
               <w:t>R² = -0.0003 | RMSE = ₹28,485.82 | MAE = ₹24,659.82</w:t>
             </w:r>
@@ -4608,17 +5107,17 @@
           <w:tcPr>
             <w:tcW w:type="dxa" w:w="2340"/>
             <w:tcMar>
-              <w:top w:w="50" w:type="dxa"/>
-              <w:bottom w:w="50" w:type="dxa"/>
-              <w:left w:w="80" w:type="dxa"/>
-              <w:right w:w="80" w:type="dxa"/>
+              <w:top w:w="60" w:type="dxa"/>
+              <w:bottom w:w="60" w:type="dxa"/>
+              <w:left w:w="100" w:type="dxa"/>
+              <w:right w:w="100" w:type="dxa"/>
             </w:tcMar>
           </w:tcPr>
           <w:p>
             <w:r>
               <w:rPr>
                 <w:rFonts w:ascii="Times New Roman" w:hAnsi="Times New Roman"/>
-                <w:sz w:val="19"/>
+                <w:sz w:val="23"/>
               </w:rPr>
               <w:t>Logistic Regression</w:t>
             </w:r>
@@ -4628,17 +5127,17 @@
           <w:tcPr>
             <w:tcW w:type="dxa" w:w="2340"/>
             <w:tcMar>
-              <w:top w:w="50" w:type="dxa"/>
-              <w:bottom w:w="50" w:type="dxa"/>
-              <w:left w:w="80" w:type="dxa"/>
-              <w:right w:w="80" w:type="dxa"/>
+              <w:top w:w="60" w:type="dxa"/>
+              <w:bottom w:w="60" w:type="dxa"/>
+              <w:left w:w="100" w:type="dxa"/>
+              <w:right w:w="100" w:type="dxa"/>
             </w:tcMar>
           </w:tcPr>
           <w:p>
             <w:r>
               <w:rPr>
                 <w:rFonts w:ascii="Times New Roman" w:hAnsi="Times New Roman"/>
-                <w:sz w:val="19"/>
+                <w:sz w:val="23"/>
               </w:rPr>
               <w:t>Supervised Classification</w:t>
             </w:r>
@@ -4648,17 +5147,17 @@
           <w:tcPr>
             <w:tcW w:type="dxa" w:w="2340"/>
             <w:tcMar>
-              <w:top w:w="50" w:type="dxa"/>
-              <w:bottom w:w="50" w:type="dxa"/>
-              <w:left w:w="80" w:type="dxa"/>
-              <w:right w:w="80" w:type="dxa"/>
+              <w:top w:w="60" w:type="dxa"/>
+              <w:bottom w:w="60" w:type="dxa"/>
+              <w:left w:w="100" w:type="dxa"/>
+              <w:right w:w="100" w:type="dxa"/>
             </w:tcMar>
           </w:tcPr>
           <w:p>
             <w:r>
               <w:rPr>
                 <w:rFonts w:ascii="Times New Roman" w:hAnsi="Times New Roman"/>
-                <w:sz w:val="19"/>
+                <w:sz w:val="23"/>
               </w:rPr>
               <w:t>Is_Fraud (0 vs 1)</w:t>
             </w:r>
@@ -4668,17 +5167,17 @@
           <w:tcPr>
             <w:tcW w:type="dxa" w:w="2340"/>
             <w:tcMar>
-              <w:top w:w="50" w:type="dxa"/>
-              <w:bottom w:w="50" w:type="dxa"/>
-              <w:left w:w="80" w:type="dxa"/>
-              <w:right w:w="80" w:type="dxa"/>
+              <w:top w:w="60" w:type="dxa"/>
+              <w:bottom w:w="60" w:type="dxa"/>
+              <w:left w:w="100" w:type="dxa"/>
+              <w:right w:w="100" w:type="dxa"/>
             </w:tcMar>
           </w:tcPr>
           <w:p>
             <w:r>
               <w:rPr>
                 <w:rFonts w:ascii="Times New Roman" w:hAnsi="Times New Roman"/>
-                <w:sz w:val="19"/>
+                <w:sz w:val="23"/>
               </w:rPr>
               <w:t>Accuracy = 94.88% | F1-Score = 0.9238</w:t>
             </w:r>
@@ -4690,17 +5189,17 @@
           <w:tcPr>
             <w:tcW w:type="dxa" w:w="2340"/>
             <w:tcMar>
-              <w:top w:w="50" w:type="dxa"/>
-              <w:bottom w:w="50" w:type="dxa"/>
-              <w:left w:w="80" w:type="dxa"/>
-              <w:right w:w="80" w:type="dxa"/>
+              <w:top w:w="60" w:type="dxa"/>
+              <w:bottom w:w="60" w:type="dxa"/>
+              <w:left w:w="100" w:type="dxa"/>
+              <w:right w:w="100" w:type="dxa"/>
             </w:tcMar>
           </w:tcPr>
           <w:p>
             <w:r>
               <w:rPr>
                 <w:rFonts w:ascii="Times New Roman" w:hAnsi="Times New Roman"/>
-                <w:sz w:val="19"/>
+                <w:sz w:val="23"/>
               </w:rPr>
               <w:t>Decision Tree Classifier</w:t>
             </w:r>
@@ -4710,17 +5209,17 @@
           <w:tcPr>
             <w:tcW w:type="dxa" w:w="2340"/>
             <w:tcMar>
-              <w:top w:w="50" w:type="dxa"/>
-              <w:bottom w:w="50" w:type="dxa"/>
-              <w:left w:w="80" w:type="dxa"/>
-              <w:right w:w="80" w:type="dxa"/>
+              <w:top w:w="60" w:type="dxa"/>
+              <w:bottom w:w="60" w:type="dxa"/>
+              <w:left w:w="100" w:type="dxa"/>
+              <w:right w:w="100" w:type="dxa"/>
             </w:tcMar>
           </w:tcPr>
           <w:p>
             <w:r>
               <w:rPr>
                 <w:rFonts w:ascii="Times New Roman" w:hAnsi="Times New Roman"/>
-                <w:sz w:val="19"/>
+                <w:sz w:val="23"/>
               </w:rPr>
               <w:t>Supervised Classification</w:t>
             </w:r>
@@ -4730,17 +5229,17 @@
           <w:tcPr>
             <w:tcW w:type="dxa" w:w="2340"/>
             <w:tcMar>
-              <w:top w:w="50" w:type="dxa"/>
-              <w:bottom w:w="50" w:type="dxa"/>
-              <w:left w:w="80" w:type="dxa"/>
-              <w:right w:w="80" w:type="dxa"/>
+              <w:top w:w="60" w:type="dxa"/>
+              <w:bottom w:w="60" w:type="dxa"/>
+              <w:left w:w="100" w:type="dxa"/>
+              <w:right w:w="100" w:type="dxa"/>
             </w:tcMar>
           </w:tcPr>
           <w:p>
             <w:r>
               <w:rPr>
                 <w:rFonts w:ascii="Times New Roman" w:hAnsi="Times New Roman"/>
-                <w:sz w:val="19"/>
+                <w:sz w:val="23"/>
               </w:rPr>
               <w:t>Is_Fraud (0 vs 1)</w:t>
             </w:r>
@@ -4750,17 +5249,17 @@
           <w:tcPr>
             <w:tcW w:type="dxa" w:w="2340"/>
             <w:tcMar>
-              <w:top w:w="50" w:type="dxa"/>
-              <w:bottom w:w="50" w:type="dxa"/>
-              <w:left w:w="80" w:type="dxa"/>
-              <w:right w:w="80" w:type="dxa"/>
+              <w:top w:w="60" w:type="dxa"/>
+              <w:bottom w:w="60" w:type="dxa"/>
+              <w:left w:w="100" w:type="dxa"/>
+              <w:right w:w="100" w:type="dxa"/>
             </w:tcMar>
           </w:tcPr>
           <w:p>
             <w:r>
               <w:rPr>
                 <w:rFonts w:ascii="Times New Roman" w:hAnsi="Times New Roman"/>
-                <w:sz w:val="19"/>
+                <w:sz w:val="23"/>
               </w:rPr>
               <w:t>Accuracy = 94.87% | F1-Score = 0.9238</w:t>
             </w:r>
@@ -4772,17 +5271,17 @@
           <w:tcPr>
             <w:tcW w:type="dxa" w:w="2340"/>
             <w:tcMar>
-              <w:top w:w="50" w:type="dxa"/>
-              <w:bottom w:w="50" w:type="dxa"/>
-              <w:left w:w="80" w:type="dxa"/>
-              <w:right w:w="80" w:type="dxa"/>
+              <w:top w:w="60" w:type="dxa"/>
+              <w:bottom w:w="60" w:type="dxa"/>
+              <w:left w:w="100" w:type="dxa"/>
+              <w:right w:w="100" w:type="dxa"/>
             </w:tcMar>
           </w:tcPr>
           <w:p>
             <w:r>
               <w:rPr>
                 <w:rFonts w:ascii="Times New Roman" w:hAnsi="Times New Roman"/>
-                <w:sz w:val="19"/>
+                <w:sz w:val="23"/>
               </w:rPr>
               <w:t>Support Vector Machine (SVM)</w:t>
             </w:r>
@@ -4792,17 +5291,17 @@
           <w:tcPr>
             <w:tcW w:type="dxa" w:w="2340"/>
             <w:tcMar>
-              <w:top w:w="50" w:type="dxa"/>
-              <w:bottom w:w="50" w:type="dxa"/>
-              <w:left w:w="80" w:type="dxa"/>
-              <w:right w:w="80" w:type="dxa"/>
+              <w:top w:w="60" w:type="dxa"/>
+              <w:bottom w:w="60" w:type="dxa"/>
+              <w:left w:w="100" w:type="dxa"/>
+              <w:right w:w="100" w:type="dxa"/>
             </w:tcMar>
           </w:tcPr>
           <w:p>
             <w:r>
               <w:rPr>
                 <w:rFonts w:ascii="Times New Roman" w:hAnsi="Times New Roman"/>
-                <w:sz w:val="19"/>
+                <w:sz w:val="23"/>
               </w:rPr>
               <w:t>Supervised Classification</w:t>
             </w:r>
@@ -4812,17 +5311,17 @@
           <w:tcPr>
             <w:tcW w:type="dxa" w:w="2340"/>
             <w:tcMar>
-              <w:top w:w="50" w:type="dxa"/>
-              <w:bottom w:w="50" w:type="dxa"/>
-              <w:left w:w="80" w:type="dxa"/>
-              <w:right w:w="80" w:type="dxa"/>
+              <w:top w:w="60" w:type="dxa"/>
+              <w:bottom w:w="60" w:type="dxa"/>
+              <w:left w:w="100" w:type="dxa"/>
+              <w:right w:w="100" w:type="dxa"/>
             </w:tcMar>
           </w:tcPr>
           <w:p>
             <w:r>
               <w:rPr>
                 <w:rFonts w:ascii="Times New Roman" w:hAnsi="Times New Roman"/>
-                <w:sz w:val="19"/>
+                <w:sz w:val="23"/>
               </w:rPr>
               <w:t>Is_Fraud (0 vs 1)</w:t>
             </w:r>
@@ -4832,17 +5331,17 @@
           <w:tcPr>
             <w:tcW w:type="dxa" w:w="2340"/>
             <w:tcMar>
-              <w:top w:w="50" w:type="dxa"/>
-              <w:bottom w:w="50" w:type="dxa"/>
-              <w:left w:w="80" w:type="dxa"/>
-              <w:right w:w="80" w:type="dxa"/>
+              <w:top w:w="60" w:type="dxa"/>
+              <w:bottom w:w="60" w:type="dxa"/>
+              <w:left w:w="100" w:type="dxa"/>
+              <w:right w:w="100" w:type="dxa"/>
             </w:tcMar>
           </w:tcPr>
           <w:p>
             <w:r>
               <w:rPr>
                 <w:rFonts w:ascii="Times New Roman" w:hAnsi="Times New Roman"/>
-                <w:sz w:val="19"/>
+                <w:sz w:val="23"/>
               </w:rPr>
               <w:t>Accuracy = 94.88% | F1-Score = 0.9238</w:t>
             </w:r>
@@ -4854,17 +5353,17 @@
           <w:tcPr>
             <w:tcW w:type="dxa" w:w="2340"/>
             <w:tcMar>
-              <w:top w:w="50" w:type="dxa"/>
-              <w:bottom w:w="50" w:type="dxa"/>
-              <w:left w:w="80" w:type="dxa"/>
-              <w:right w:w="80" w:type="dxa"/>
+              <w:top w:w="60" w:type="dxa"/>
+              <w:bottom w:w="60" w:type="dxa"/>
+              <w:left w:w="100" w:type="dxa"/>
+              <w:right w:w="100" w:type="dxa"/>
             </w:tcMar>
           </w:tcPr>
           <w:p>
             <w:r>
               <w:rPr>
                 <w:rFonts w:ascii="Times New Roman" w:hAnsi="Times New Roman"/>
-                <w:sz w:val="19"/>
+                <w:sz w:val="23"/>
               </w:rPr>
               <w:t>Gaussian Naive Bayes</w:t>
             </w:r>
@@ -4874,17 +5373,17 @@
           <w:tcPr>
             <w:tcW w:type="dxa" w:w="2340"/>
             <w:tcMar>
-              <w:top w:w="50" w:type="dxa"/>
-              <w:bottom w:w="50" w:type="dxa"/>
-              <w:left w:w="80" w:type="dxa"/>
-              <w:right w:w="80" w:type="dxa"/>
+              <w:top w:w="60" w:type="dxa"/>
+              <w:bottom w:w="60" w:type="dxa"/>
+              <w:left w:w="100" w:type="dxa"/>
+              <w:right w:w="100" w:type="dxa"/>
             </w:tcMar>
           </w:tcPr>
           <w:p>
             <w:r>
               <w:rPr>
                 <w:rFonts w:ascii="Times New Roman" w:hAnsi="Times New Roman"/>
-                <w:sz w:val="19"/>
+                <w:sz w:val="23"/>
               </w:rPr>
               <w:t>Supervised Classification</w:t>
             </w:r>
@@ -4894,17 +5393,17 @@
           <w:tcPr>
             <w:tcW w:type="dxa" w:w="2340"/>
             <w:tcMar>
-              <w:top w:w="50" w:type="dxa"/>
-              <w:bottom w:w="50" w:type="dxa"/>
-              <w:left w:w="80" w:type="dxa"/>
-              <w:right w:w="80" w:type="dxa"/>
+              <w:top w:w="60" w:type="dxa"/>
+              <w:bottom w:w="60" w:type="dxa"/>
+              <w:left w:w="100" w:type="dxa"/>
+              <w:right w:w="100" w:type="dxa"/>
             </w:tcMar>
           </w:tcPr>
           <w:p>
             <w:r>
               <w:rPr>
                 <w:rFonts w:ascii="Times New Roman" w:hAnsi="Times New Roman"/>
-                <w:sz w:val="19"/>
+                <w:sz w:val="23"/>
               </w:rPr>
               <w:t>Is_Fraud (0 vs 1)</w:t>
             </w:r>
@@ -4914,17 +5413,17 @@
           <w:tcPr>
             <w:tcW w:type="dxa" w:w="2340"/>
             <w:tcMar>
-              <w:top w:w="50" w:type="dxa"/>
-              <w:bottom w:w="50" w:type="dxa"/>
-              <w:left w:w="80" w:type="dxa"/>
-              <w:right w:w="80" w:type="dxa"/>
+              <w:top w:w="60" w:type="dxa"/>
+              <w:bottom w:w="60" w:type="dxa"/>
+              <w:left w:w="100" w:type="dxa"/>
+              <w:right w:w="100" w:type="dxa"/>
             </w:tcMar>
           </w:tcPr>
           <w:p>
             <w:r>
               <w:rPr>
                 <w:rFonts w:ascii="Times New Roman" w:hAnsi="Times New Roman"/>
-                <w:sz w:val="19"/>
+                <w:sz w:val="23"/>
               </w:rPr>
               <w:t>Accuracy = 94.88% | F1-Score = 0.9238</w:t>
             </w:r>
@@ -4946,7 +5445,7 @@
         <w:rPr>
           <w:rFonts w:ascii="Times New Roman" w:hAnsi="Times New Roman"/>
           <w:b/>
-          <w:sz w:val="28"/>
+          <w:sz w:val="30"/>
         </w:rPr>
         <w:t>11. Result Analysis</w:t>
       </w:r>
@@ -4958,12 +5457,12 @@
     </w:p>
     <w:p>
       <w:r>
-        <w:t>2. Supervised Regression Analysis (Linear Regression): The Linear Regression model predicting Transaction_Amount produced R² = -0.0003, RMSE = ₹28,485.82, and MAE = ₹24,659.82. In Figure 2, the scatter points form a horizontal line at y ≈ ₹50,000 across all actual transaction values. This empirical behavior occurs because demographic attributes (Age, Gender) and account balances have near-zero linear correlation with the specific transaction value spent by a customer. When mathematical correlation between input features and target is zero, the optimal hyperplane that minimizes Mean Squared Error (MSE) is a flat line equal to the dataset mean: ŷ = 0·X + 50,000 = 50,000. This accurately reflects the behavioral reality of commercial banking datasets.</w:t>
+        <w:t>2. Supervised Regression Analysis (Linear Regression): The Linear Regression model predicting Transaction_Amount produced R² = -0.0003, RMSE = ₹28,485.82, and MAE = ₹24,659.82. In Figure 4, the scatter points form a horizontal line at y ≈ ₹50,000 across all actual transaction values. This empirical behavior occurs because demographic attributes (Age, Gender) and account balances have near-zero linear correlation with the specific transaction value spent by a customer. When mathematical correlation between input features and target is zero, the optimal hyperplane that minimizes Mean Squared Error (MSE) is a flat line equal to the dataset mean: ŷ = 0·X + 50,000 = 50,000. This accurately reflects the behavioral reality of commercial banking datasets.</w:t>
       </w:r>
     </w:p>
     <w:p>
       <w:r>
-        <w:t>3. Supervised Classification Analysis (Fraud Detection): The four benchmarked classification algorithms achieved approximately 94.88% Accuracy and an F1-Score of 0.9238 on the 39,951 test records. This accuracy directly reflects the 95:5 class imbalance in the dataset (94.96% legitimate versus 5.04% fraud). As evidenced by the Confusion Matrix in Figure 3, linear classifiers converged toward predicting the majority legitimate class to minimize cross-entropy loss. The Decision Tree Classifier captured non-linear hierarchical decision rules with 94.87% accuracy. These results demonstrate why cluster computing fraud detection pipelines must prioritize balanced metrics like F1-score and confusion matrices rather than evaluating models solely on raw accuracy.</w:t>
+        <w:t>3. Supervised Classification Analysis (Fraud Detection): The four benchmarked classification algorithms achieved approximately 94.88% Accuracy and an F1-Score of 0.9238 on the 39,951 test records. This accuracy directly reflects the 95:5 class imbalance in the dataset (94.96% legitimate versus 5.04% fraud). As evidenced by the Confusion Matrix in Figure 5, linear classifiers converged toward predicting the majority legitimate class to minimize cross-entropy loss. The Decision Tree Classifier captured non-linear hierarchical decision rules with 94.87% accuracy. These results demonstrate why cluster computing fraud detection pipelines must prioritize balanced metrics like F1-score and confusion matrices rather than evaluating models solely on raw accuracy.</w:t>
       </w:r>
     </w:p>
     <w:p>
@@ -4975,7 +5474,7 @@
         <w:rPr>
           <w:rFonts w:ascii="Times New Roman" w:hAnsi="Times New Roman"/>
           <w:b/>
-          <w:sz w:val="28"/>
+          <w:sz w:val="30"/>
         </w:rPr>
         <w:t>12. Conclusion</w:t>
       </w:r>
@@ -5002,13 +5501,13 @@
     <w:p>
       <w:pPr>
         <w:keepNext/>
-        <w:spacing w:before="240" w:after="80"/>
+        <w:spacing w:before="280" w:after="80"/>
       </w:pPr>
       <w:r>
         <w:rPr>
           <w:rFonts w:ascii="Times New Roman" w:hAnsi="Times New Roman"/>
           <w:b/>
-          <w:sz w:val="24"/>
+          <w:sz w:val="26"/>
         </w:rPr>
         <w:t>References</w:t>
       </w:r>
@@ -5021,7 +5520,7 @@
       <w:r>
         <w:rPr>
           <w:rFonts w:ascii="Times New Roman" w:hAnsi="Times New Roman"/>
-          <w:sz w:val="20"/>
+          <w:sz w:val="23"/>
         </w:rPr>
         <w:t>Apache Spark Documentation. 'Spark Overview and Cluster Mode Overview.' Apache Software Foundation, https://spark.apache.org/docs/3.5.0/</w:t>
       </w:r>
@@ -5034,7 +5533,7 @@
       <w:r>
         <w:rPr>
           <w:rFonts w:ascii="Times New Roman" w:hAnsi="Times New Roman"/>
-          <w:sz w:val="20"/>
+          <w:sz w:val="23"/>
         </w:rPr>
         <w:t>Apache Spark MLlib Documentation. 'Machine Learning Library (MLlib) Guide.' https://spark.apache.org/docs/3.5.0/ml-guide.html</w:t>
       </w:r>
@@ -5047,7 +5546,7 @@
       <w:r>
         <w:rPr>
           <w:rFonts w:ascii="Times New Roman" w:hAnsi="Times New Roman"/>
-          <w:sz w:val="20"/>
+          <w:sz w:val="23"/>
         </w:rPr>
         <w:t>Zaharia, M., et al. 'Resilient Distributed Datasets: A Fault-Tolerant Abstraction for In-Memory Cluster Computing.' NSDI, 2012.</w:t>
       </w:r>
@@ -5060,7 +5559,7 @@
       <w:r>
         <w:rPr>
           <w:rFonts w:ascii="Times New Roman" w:hAnsi="Times New Roman"/>
-          <w:sz w:val="20"/>
+          <w:sz w:val="23"/>
         </w:rPr>
         <w:t>Kaggle Financial Datasets. 'Bank Transaction Fraud Detection Dataset by Marusagar.' https://www.kaggle.com/datasets/marusagar/bank-transaction-fraud-detection</w:t>
       </w:r>
@@ -5073,7 +5572,7 @@
       <w:r>
         <w:rPr>
           <w:rFonts w:ascii="Times New Roman" w:hAnsi="Times New Roman"/>
-          <w:sz w:val="20"/>
+          <w:sz w:val="23"/>
         </w:rPr>
         <w:t>Python Software Foundation. 'PySpark Python API Reference.' https://spark.apache.org/docs/latest/api/python/</w:t>
       </w:r>
@@ -5452,7 +5951,7 @@
     <w:qFormat/>
     <w:rsid w:val="00FC693F"/>
     <w:pPr>
-      <w:spacing w:line="276" w:lineRule="auto" w:after="120"/>
+      <w:spacing w:line="288" w:lineRule="auto" w:after="120"/>
     </w:pPr>
     <w:rPr>
       <w:rFonts w:ascii="Times New Roman" w:hAnsi="Times New Roman"/>

</xml_diff>